<commit_message>
Normalize PR remark template font
</commit_message>
<xml_diff>
--- a/storage/templates/PR_STANDARD_V1.docx
+++ b/storage/templates/PR_STANDARD_V1.docx
@@ -22,17 +22,7 @@
           <w:sz w:val="24"/>
           <w:szCs w:val="32"/>
         </w:rPr>
-        <w:t xml:space="preserve">REF NO: </w:t>
-      </w:r>
-      <w:r>
-        <w:rPr>
-          <w:rFonts w:ascii="Browallia New" w:hAnsi="Browallia New" w:cs="Browallia New"/>
-          <w:b/>
-          <w:bCs/>
-          <w:sz w:val="24"/>
-          <w:szCs w:val="32"/>
-        </w:rPr>
-        <w:t>{</w:t>
+        <w:t>REF NO: {</w:t>
       </w:r>
       <w:r>
         <w:rPr>
@@ -559,14 +549,14 @@
             </w:pPr>
             <w:r>
               <w:rPr>
-                <w:rFonts w:ascii="Browallia New" w:hAnsi="Browallia New" w:eastAsia="Browallia New"/>
+                <w:rFonts w:ascii="Browallia New" w:eastAsia="Browallia New" w:hAnsi="Browallia New"/>
                 <w:sz w:val="24"/>
               </w:rPr>
               <w:t>{</w:t>
             </w:r>
             <w:r>
               <w:rPr>
-                <w:rFonts w:ascii="Browallia New" w:hAnsi="Browallia New" w:eastAsia="Browallia New"/>
+                <w:rFonts w:ascii="Browallia New" w:eastAsia="Browallia New" w:hAnsi="Browallia New"/>
                 <w:sz w:val="2"/>
               </w:rPr>
               <w:t>d.purposeNewMark}</w:t>
@@ -626,14 +616,14 @@
             </w:pPr>
             <w:r>
               <w:rPr>
-                <w:rFonts w:ascii="Browallia New" w:hAnsi="Browallia New" w:eastAsia="Browallia New"/>
+                <w:rFonts w:ascii="Browallia New" w:eastAsia="Browallia New" w:hAnsi="Browallia New"/>
                 <w:sz w:val="24"/>
               </w:rPr>
               <w:t>{</w:t>
             </w:r>
             <w:r>
               <w:rPr>
-                <w:rFonts w:ascii="Browallia New" w:hAnsi="Browallia New" w:eastAsia="Browallia New"/>
+                <w:rFonts w:ascii="Browallia New" w:eastAsia="Browallia New" w:hAnsi="Browallia New"/>
                 <w:sz w:val="2"/>
               </w:rPr>
               <w:t>d.purposeReplacementMark}</w:t>
@@ -721,14 +711,14 @@
             </w:pPr>
             <w:r>
               <w:rPr>
-                <w:rFonts w:ascii="Browallia New" w:hAnsi="Browallia New" w:eastAsia="Browallia New"/>
+                <w:rFonts w:ascii="Browallia New" w:eastAsia="Browallia New" w:hAnsi="Browallia New"/>
                 <w:sz w:val="24"/>
               </w:rPr>
               <w:t>{</w:t>
             </w:r>
             <w:r>
               <w:rPr>
-                <w:rFonts w:ascii="Browallia New" w:hAnsi="Browallia New" w:eastAsia="Browallia New"/>
+                <w:rFonts w:ascii="Browallia New" w:eastAsia="Browallia New" w:hAnsi="Browallia New"/>
                 <w:sz w:val="2"/>
               </w:rPr>
               <w:t>d.purchaseByProcurementMark}</w:t>
@@ -808,14 +798,14 @@
             </w:pPr>
             <w:r>
               <w:rPr>
-                <w:rFonts w:ascii="Browallia New" w:hAnsi="Browallia New" w:eastAsia="Browallia New"/>
+                <w:rFonts w:ascii="Browallia New" w:eastAsia="Browallia New" w:hAnsi="Browallia New"/>
                 <w:sz w:val="24"/>
               </w:rPr>
               <w:t>{</w:t>
             </w:r>
             <w:r>
               <w:rPr>
-                <w:rFonts w:ascii="Browallia New" w:hAnsi="Browallia New" w:eastAsia="Browallia New"/>
+                <w:rFonts w:ascii="Browallia New" w:eastAsia="Browallia New" w:hAnsi="Browallia New"/>
                 <w:sz w:val="2"/>
               </w:rPr>
               <w:t>d.purposeRepairMark}</w:t>
@@ -874,14 +864,14 @@
             </w:pPr>
             <w:r>
               <w:rPr>
-                <w:rFonts w:ascii="Browallia New" w:hAnsi="Browallia New" w:eastAsia="Browallia New"/>
+                <w:rFonts w:ascii="Browallia New" w:eastAsia="Browallia New" w:hAnsi="Browallia New"/>
                 <w:sz w:val="24"/>
               </w:rPr>
               <w:t>{</w:t>
             </w:r>
             <w:r>
               <w:rPr>
-                <w:rFonts w:ascii="Browallia New" w:hAnsi="Browallia New" w:eastAsia="Browallia New"/>
+                <w:rFonts w:ascii="Browallia New" w:eastAsia="Browallia New" w:hAnsi="Browallia New"/>
                 <w:sz w:val="2"/>
               </w:rPr>
               <w:t>d.purposeRenewalMark}</w:t>
@@ -961,14 +951,14 @@
             </w:pPr>
             <w:r>
               <w:rPr>
-                <w:rFonts w:ascii="Browallia New" w:hAnsi="Browallia New" w:eastAsia="Browallia New"/>
+                <w:rFonts w:ascii="Browallia New" w:eastAsia="Browallia New" w:hAnsi="Browallia New"/>
                 <w:sz w:val="24"/>
               </w:rPr>
               <w:t>{</w:t>
             </w:r>
             <w:r>
               <w:rPr>
-                <w:rFonts w:ascii="Browallia New" w:hAnsi="Browallia New" w:eastAsia="Browallia New"/>
+                <w:rFonts w:ascii="Browallia New" w:eastAsia="Browallia New" w:hAnsi="Browallia New"/>
                 <w:sz w:val="2"/>
               </w:rPr>
               <w:t>d.purchaseSelfMark}</w:t>
@@ -1018,16 +1008,15 @@
           </w:tcPr>
           <w:p>
             <w:pPr>
-              <w:spacing w:before="0" w:after="0" w:line="240" w:lineRule="auto"/>
-              <w:rPr>
-                <w:rFonts w:ascii="Browallia New" w:hAnsi="Browallia New" w:cs="Browallia New"/>
-                <w:sz w:val="24"/>
-                <w:szCs w:val="24"/>
-              </w:rPr>
-            </w:pPr>
-            <w:r>
-              <w:rPr>
-                <w:rFonts w:ascii="Browallia New" w:hAnsi="Browallia New" w:eastAsia="Browallia New"/>
+              <w:rPr>
+                <w:rFonts w:ascii="Browallia New" w:hAnsi="Browallia New" w:cs="Browallia New"/>
+                <w:sz w:val="24"/>
+                <w:szCs w:val="24"/>
+              </w:rPr>
+            </w:pPr>
+            <w:r>
+              <w:rPr>
+                <w:rFonts w:ascii="Browallia New" w:eastAsia="Browallia New" w:hAnsi="Browallia New"/>
                 <w:sz w:val="2"/>
               </w:rPr>
               <w:t>{d.companyName:set(c.templateCompanyName)}{d.branchName:set(c.templateBranchName)}{d.purpose:set(c.templatePurpose)}{d.purchaseMethod:set(c.templatePurchaseMethod)}</w:t>
@@ -1052,12 +1041,6 @@
                 <w:szCs w:val="24"/>
               </w:rPr>
             </w:pPr>
-            <w:r>
-              <w:rPr>
-                <w:rFonts w:ascii="Browallia New" w:hAnsi="Browallia New" w:eastAsia="Browallia New"/>
-                <w:sz w:val="2"/>
-              </w:rPr>
-            </w:r>
           </w:p>
         </w:tc>
         <w:tc>
@@ -1079,12 +1062,6 @@
                 <w:szCs w:val="24"/>
               </w:rPr>
             </w:pPr>
-            <w:r>
-              <w:rPr>
-                <w:rFonts w:ascii="Browallia New" w:hAnsi="Browallia New" w:eastAsia="Browallia New"/>
-                <w:sz w:val="2"/>
-              </w:rPr>
-            </w:r>
           </w:p>
         </w:tc>
         <w:tc>
@@ -1105,12 +1082,6 @@
                 <w:szCs w:val="24"/>
               </w:rPr>
             </w:pPr>
-            <w:r>
-              <w:rPr>
-                <w:rFonts w:ascii="Browallia New" w:hAnsi="Browallia New" w:eastAsia="Browallia New"/>
-                <w:sz w:val="2"/>
-              </w:rPr>
-            </w:r>
           </w:p>
         </w:tc>
         <w:tc>
@@ -1131,12 +1102,6 @@
                 <w:szCs w:val="24"/>
               </w:rPr>
             </w:pPr>
-            <w:r>
-              <w:rPr>
-                <w:rFonts w:ascii="Browallia New" w:hAnsi="Browallia New" w:eastAsia="Browallia New"/>
-                <w:sz w:val="2"/>
-              </w:rPr>
-            </w:r>
           </w:p>
         </w:tc>
         <w:tc>
@@ -1158,12 +1123,6 @@
                 <w:szCs w:val="24"/>
               </w:rPr>
             </w:pPr>
-            <w:r>
-              <w:rPr>
-                <w:rFonts w:ascii="Browallia New" w:hAnsi="Browallia New" w:eastAsia="Browallia New"/>
-                <w:sz w:val="2"/>
-              </w:rPr>
-            </w:r>
           </w:p>
         </w:tc>
         <w:tc>
@@ -1184,12 +1143,6 @@
                 <w:szCs w:val="24"/>
               </w:rPr>
             </w:pPr>
-            <w:r>
-              <w:rPr>
-                <w:rFonts w:ascii="Browallia New" w:hAnsi="Browallia New" w:eastAsia="Browallia New"/>
-                <w:sz w:val="2"/>
-              </w:rPr>
-            </w:r>
           </w:p>
         </w:tc>
         <w:tc>
@@ -1210,12 +1163,6 @@
                 <w:szCs w:val="24"/>
               </w:rPr>
             </w:pPr>
-            <w:r>
-              <w:rPr>
-                <w:rFonts w:ascii="Browallia New" w:hAnsi="Browallia New" w:eastAsia="Browallia New"/>
-                <w:sz w:val="2"/>
-              </w:rPr>
-            </w:r>
           </w:p>
         </w:tc>
       </w:tr>
@@ -1776,14 +1723,14 @@
             </w:pPr>
             <w:r>
               <w:rPr>
-                <w:rFonts w:ascii="Browallia New" w:hAnsi="Browallia New" w:eastAsia="Browallia New"/>
+                <w:rFonts w:ascii="Browallia New" w:eastAsia="Browallia New" w:hAnsi="Browallia New"/>
                 <w:sz w:val="24"/>
               </w:rPr>
               <w:t>{</w:t>
             </w:r>
             <w:r>
               <w:rPr>
-                <w:rFonts w:ascii="Browallia New" w:hAnsi="Browallia New" w:eastAsia="Browallia New"/>
+                <w:rFonts w:ascii="Browallia New" w:eastAsia="Browallia New" w:hAnsi="Browallia New"/>
                 <w:sz w:val="2"/>
               </w:rPr>
               <w:t>d.items[i].accountCode}</w:t>
@@ -1883,14 +1830,14 @@
             </w:pPr>
             <w:r>
               <w:rPr>
-                <w:rFonts w:ascii="Browallia New" w:hAnsi="Browallia New" w:eastAsia="Browallia New"/>
+                <w:rFonts w:ascii="Browallia New" w:eastAsia="Browallia New" w:hAnsi="Browallia New"/>
                 <w:sz w:val="24"/>
               </w:rPr>
               <w:t>{</w:t>
             </w:r>
             <w:r>
               <w:rPr>
-                <w:rFonts w:ascii="Browallia New" w:hAnsi="Browallia New" w:eastAsia="Browallia New"/>
+                <w:rFonts w:ascii="Browallia New" w:eastAsia="Browallia New" w:hAnsi="Browallia New"/>
                 <w:sz w:val="2"/>
               </w:rPr>
               <w:t>d.items[i].unitCostFormatted}</w:t>
@@ -1917,14 +1864,14 @@
             </w:pPr>
             <w:r>
               <w:rPr>
-                <w:rFonts w:ascii="Browallia New" w:hAnsi="Browallia New" w:eastAsia="Browallia New"/>
+                <w:rFonts w:ascii="Browallia New" w:eastAsia="Browallia New" w:hAnsi="Browallia New"/>
                 <w:sz w:val="24"/>
               </w:rPr>
               <w:t>{</w:t>
             </w:r>
             <w:r>
               <w:rPr>
-                <w:rFonts w:ascii="Browallia New" w:hAnsi="Browallia New" w:eastAsia="Browallia New"/>
+                <w:rFonts w:ascii="Browallia New" w:eastAsia="Browallia New" w:hAnsi="Browallia New"/>
                 <w:sz w:val="2"/>
               </w:rPr>
               <w:t>d.items[i].totalAmountFormatted}</w:t>
@@ -2175,6 +2122,922 @@
                 <w:rFonts w:ascii="Browallia New" w:hAnsi="Browallia New" w:cs="Browallia New"/>
                 <w:sz w:val="24"/>
                 <w:szCs w:val="24"/>
+              </w:rPr>
+            </w:pPr>
+          </w:p>
+        </w:tc>
+      </w:tr>
+      <w:tr>
+        <w:tc>
+          <w:tcPr>
+            <w:tcW w:w="817" w:type="dxa"/>
+            <w:tcBorders>
+              <w:top w:val="single" w:sz="4" w:space="0" w:color="auto"/>
+              <w:bottom w:val="single" w:sz="4" w:space="0" w:color="auto"/>
+            </w:tcBorders>
+          </w:tcPr>
+          <w:p>
+            <w:pPr>
+              <w:jc w:val="center"/>
+              <w:rPr>
+                <w:rFonts w:ascii="Browallia New" w:hAnsi="Browallia New" w:cs="Browallia New"/>
+                <w:sz w:val="24"/>
+                <w:szCs w:val="24"/>
+              </w:rPr>
+            </w:pPr>
+          </w:p>
+        </w:tc>
+        <w:tc>
+          <w:tcPr>
+            <w:tcW w:w="717" w:type="dxa"/>
+            <w:tcBorders>
+              <w:top w:val="single" w:sz="4" w:space="0" w:color="auto"/>
+              <w:bottom w:val="single" w:sz="4" w:space="0" w:color="auto"/>
+            </w:tcBorders>
+          </w:tcPr>
+          <w:p>
+            <w:pPr>
+              <w:rPr>
+                <w:rFonts w:ascii="Browallia New" w:hAnsi="Browallia New" w:cs="Browallia New"/>
+                <w:sz w:val="24"/>
+                <w:szCs w:val="24"/>
+              </w:rPr>
+            </w:pPr>
+          </w:p>
+        </w:tc>
+        <w:tc>
+          <w:tcPr>
+            <w:tcW w:w="5040" w:type="dxa"/>
+            <w:tcBorders>
+              <w:top w:val="single" w:sz="4" w:space="0" w:color="auto"/>
+              <w:bottom w:val="single" w:sz="4" w:space="0" w:color="auto"/>
+            </w:tcBorders>
+          </w:tcPr>
+          <w:p>
+            <w:pPr>
+              <w:rPr>
+                <w:rFonts w:ascii="Browallia New" w:hAnsi="Browallia New" w:cs="Browallia New"/>
+                <w:sz w:val="24"/>
+                <w:szCs w:val="24"/>
+                <w:cs/>
+              </w:rPr>
+            </w:pPr>
+          </w:p>
+        </w:tc>
+        <w:tc>
+          <w:tcPr>
+            <w:tcW w:w="900" w:type="dxa"/>
+            <w:tcBorders>
+              <w:top w:val="single" w:sz="4" w:space="0" w:color="auto"/>
+              <w:bottom w:val="single" w:sz="4" w:space="0" w:color="auto"/>
+            </w:tcBorders>
+          </w:tcPr>
+          <w:p>
+            <w:pPr>
+              <w:jc w:val="center"/>
+              <w:rPr>
+                <w:rFonts w:ascii="Browallia New" w:hAnsi="Browallia New" w:cs="Browallia New"/>
+                <w:sz w:val="24"/>
+                <w:szCs w:val="24"/>
+              </w:rPr>
+            </w:pPr>
+          </w:p>
+        </w:tc>
+        <w:tc>
+          <w:tcPr>
+            <w:tcW w:w="1080" w:type="dxa"/>
+            <w:tcBorders>
+              <w:top w:val="single" w:sz="4" w:space="0" w:color="auto"/>
+              <w:bottom w:val="single" w:sz="4" w:space="0" w:color="auto"/>
+            </w:tcBorders>
+          </w:tcPr>
+          <w:p>
+            <w:pPr>
+              <w:jc w:val="right"/>
+              <w:rPr>
+                <w:rFonts w:ascii="Browallia New" w:hAnsi="Browallia New" w:cs="Browallia New"/>
+                <w:sz w:val="24"/>
+                <w:szCs w:val="24"/>
+              </w:rPr>
+            </w:pPr>
+          </w:p>
+        </w:tc>
+        <w:tc>
+          <w:tcPr>
+            <w:tcW w:w="1511" w:type="dxa"/>
+            <w:tcBorders>
+              <w:top w:val="single" w:sz="4" w:space="0" w:color="auto"/>
+              <w:bottom w:val="single" w:sz="4" w:space="0" w:color="auto"/>
+            </w:tcBorders>
+          </w:tcPr>
+          <w:p>
+            <w:pPr>
+              <w:jc w:val="right"/>
+              <w:rPr>
+                <w:rFonts w:ascii="Browallia New" w:hAnsi="Browallia New" w:cs="Browallia New"/>
+                <w:sz w:val="24"/>
+                <w:szCs w:val="24"/>
+              </w:rPr>
+            </w:pPr>
+          </w:p>
+        </w:tc>
+      </w:tr>
+      <w:tr>
+        <w:tc>
+          <w:tcPr>
+            <w:tcW w:w="817" w:type="dxa"/>
+            <w:tcBorders>
+              <w:top w:val="single" w:sz="4" w:space="0" w:color="auto"/>
+              <w:bottom w:val="single" w:sz="4" w:space="0" w:color="auto"/>
+            </w:tcBorders>
+          </w:tcPr>
+          <w:p>
+            <w:pPr>
+              <w:jc w:val="center"/>
+              <w:rPr>
+                <w:rFonts w:ascii="Browallia New" w:hAnsi="Browallia New" w:cs="Browallia New"/>
+                <w:sz w:val="24"/>
+                <w:szCs w:val="24"/>
+              </w:rPr>
+            </w:pPr>
+          </w:p>
+        </w:tc>
+        <w:tc>
+          <w:tcPr>
+            <w:tcW w:w="717" w:type="dxa"/>
+            <w:tcBorders>
+              <w:top w:val="single" w:sz="4" w:space="0" w:color="auto"/>
+              <w:bottom w:val="single" w:sz="4" w:space="0" w:color="auto"/>
+            </w:tcBorders>
+          </w:tcPr>
+          <w:p>
+            <w:pPr>
+              <w:rPr>
+                <w:rFonts w:ascii="Browallia New" w:hAnsi="Browallia New" w:cs="Browallia New"/>
+                <w:sz w:val="24"/>
+                <w:szCs w:val="24"/>
+              </w:rPr>
+            </w:pPr>
+          </w:p>
+        </w:tc>
+        <w:tc>
+          <w:tcPr>
+            <w:tcW w:w="5040" w:type="dxa"/>
+            <w:tcBorders>
+              <w:top w:val="single" w:sz="4" w:space="0" w:color="auto"/>
+              <w:bottom w:val="single" w:sz="4" w:space="0" w:color="auto"/>
+            </w:tcBorders>
+          </w:tcPr>
+          <w:p>
+            <w:pPr>
+              <w:rPr>
+                <w:rFonts w:ascii="Browallia New" w:hAnsi="Browallia New" w:cs="Browallia New"/>
+                <w:sz w:val="24"/>
+                <w:szCs w:val="24"/>
+              </w:rPr>
+            </w:pPr>
+          </w:p>
+        </w:tc>
+        <w:tc>
+          <w:tcPr>
+            <w:tcW w:w="900" w:type="dxa"/>
+            <w:tcBorders>
+              <w:top w:val="single" w:sz="4" w:space="0" w:color="auto"/>
+              <w:bottom w:val="single" w:sz="4" w:space="0" w:color="auto"/>
+            </w:tcBorders>
+          </w:tcPr>
+          <w:p>
+            <w:pPr>
+              <w:jc w:val="center"/>
+              <w:rPr>
+                <w:rFonts w:ascii="Browallia New" w:hAnsi="Browallia New" w:cs="Browallia New"/>
+                <w:sz w:val="24"/>
+                <w:szCs w:val="24"/>
+              </w:rPr>
+            </w:pPr>
+          </w:p>
+        </w:tc>
+        <w:tc>
+          <w:tcPr>
+            <w:tcW w:w="1080" w:type="dxa"/>
+            <w:tcBorders>
+              <w:top w:val="single" w:sz="4" w:space="0" w:color="auto"/>
+              <w:bottom w:val="single" w:sz="4" w:space="0" w:color="auto"/>
+            </w:tcBorders>
+          </w:tcPr>
+          <w:p>
+            <w:pPr>
+              <w:jc w:val="right"/>
+              <w:rPr>
+                <w:rFonts w:ascii="Browallia New" w:hAnsi="Browallia New" w:cs="Browallia New"/>
+                <w:sz w:val="24"/>
+                <w:szCs w:val="24"/>
+              </w:rPr>
+            </w:pPr>
+          </w:p>
+        </w:tc>
+        <w:tc>
+          <w:tcPr>
+            <w:tcW w:w="1511" w:type="dxa"/>
+            <w:tcBorders>
+              <w:top w:val="single" w:sz="4" w:space="0" w:color="auto"/>
+              <w:bottom w:val="single" w:sz="4" w:space="0" w:color="auto"/>
+            </w:tcBorders>
+          </w:tcPr>
+          <w:p>
+            <w:pPr>
+              <w:jc w:val="right"/>
+              <w:rPr>
+                <w:rFonts w:ascii="Browallia New" w:hAnsi="Browallia New" w:cs="Browallia New"/>
+                <w:sz w:val="24"/>
+                <w:szCs w:val="24"/>
+              </w:rPr>
+            </w:pPr>
+          </w:p>
+        </w:tc>
+      </w:tr>
+      <w:tr>
+        <w:tc>
+          <w:tcPr>
+            <w:tcW w:w="817" w:type="dxa"/>
+            <w:tcBorders>
+              <w:top w:val="single" w:sz="4" w:space="0" w:color="auto"/>
+              <w:bottom w:val="single" w:sz="4" w:space="0" w:color="auto"/>
+            </w:tcBorders>
+          </w:tcPr>
+          <w:p>
+            <w:pPr>
+              <w:jc w:val="center"/>
+              <w:rPr>
+                <w:rFonts w:ascii="Browallia New" w:hAnsi="Browallia New" w:cs="Browallia New"/>
+                <w:sz w:val="24"/>
+                <w:szCs w:val="24"/>
+              </w:rPr>
+            </w:pPr>
+          </w:p>
+        </w:tc>
+        <w:tc>
+          <w:tcPr>
+            <w:tcW w:w="717" w:type="dxa"/>
+            <w:tcBorders>
+              <w:top w:val="single" w:sz="4" w:space="0" w:color="auto"/>
+              <w:bottom w:val="single" w:sz="4" w:space="0" w:color="auto"/>
+            </w:tcBorders>
+          </w:tcPr>
+          <w:p>
+            <w:pPr>
+              <w:rPr>
+                <w:rFonts w:ascii="Browallia New" w:hAnsi="Browallia New" w:cs="Browallia New"/>
+                <w:sz w:val="24"/>
+                <w:szCs w:val="24"/>
+              </w:rPr>
+            </w:pPr>
+          </w:p>
+        </w:tc>
+        <w:tc>
+          <w:tcPr>
+            <w:tcW w:w="5040" w:type="dxa"/>
+            <w:tcBorders>
+              <w:top w:val="single" w:sz="4" w:space="0" w:color="auto"/>
+              <w:bottom w:val="single" w:sz="4" w:space="0" w:color="auto"/>
+            </w:tcBorders>
+          </w:tcPr>
+          <w:p>
+            <w:pPr>
+              <w:rPr>
+                <w:rFonts w:ascii="Browallia New" w:hAnsi="Browallia New" w:cs="Browallia New"/>
+                <w:sz w:val="24"/>
+                <w:szCs w:val="24"/>
+              </w:rPr>
+            </w:pPr>
+          </w:p>
+        </w:tc>
+        <w:tc>
+          <w:tcPr>
+            <w:tcW w:w="900" w:type="dxa"/>
+            <w:tcBorders>
+              <w:top w:val="single" w:sz="4" w:space="0" w:color="auto"/>
+              <w:bottom w:val="single" w:sz="4" w:space="0" w:color="auto"/>
+            </w:tcBorders>
+          </w:tcPr>
+          <w:p>
+            <w:pPr>
+              <w:jc w:val="center"/>
+              <w:rPr>
+                <w:rFonts w:ascii="Browallia New" w:hAnsi="Browallia New" w:cs="Browallia New"/>
+                <w:sz w:val="24"/>
+                <w:szCs w:val="24"/>
+              </w:rPr>
+            </w:pPr>
+          </w:p>
+        </w:tc>
+        <w:tc>
+          <w:tcPr>
+            <w:tcW w:w="1080" w:type="dxa"/>
+            <w:tcBorders>
+              <w:top w:val="single" w:sz="4" w:space="0" w:color="auto"/>
+              <w:bottom w:val="single" w:sz="4" w:space="0" w:color="auto"/>
+            </w:tcBorders>
+          </w:tcPr>
+          <w:p>
+            <w:pPr>
+              <w:jc w:val="right"/>
+              <w:rPr>
+                <w:rFonts w:ascii="Browallia New" w:hAnsi="Browallia New" w:cs="Browallia New"/>
+                <w:sz w:val="24"/>
+                <w:szCs w:val="24"/>
+              </w:rPr>
+            </w:pPr>
+          </w:p>
+        </w:tc>
+        <w:tc>
+          <w:tcPr>
+            <w:tcW w:w="1511" w:type="dxa"/>
+            <w:tcBorders>
+              <w:top w:val="single" w:sz="4" w:space="0" w:color="auto"/>
+              <w:bottom w:val="single" w:sz="4" w:space="0" w:color="auto"/>
+            </w:tcBorders>
+          </w:tcPr>
+          <w:p>
+            <w:pPr>
+              <w:jc w:val="right"/>
+              <w:rPr>
+                <w:rFonts w:ascii="Browallia New" w:hAnsi="Browallia New" w:cs="Browallia New"/>
+                <w:sz w:val="24"/>
+                <w:szCs w:val="24"/>
+              </w:rPr>
+            </w:pPr>
+          </w:p>
+        </w:tc>
+      </w:tr>
+      <w:tr>
+        <w:tc>
+          <w:tcPr>
+            <w:tcW w:w="817" w:type="dxa"/>
+            <w:tcBorders>
+              <w:top w:val="single" w:sz="4" w:space="0" w:color="auto"/>
+              <w:bottom w:val="single" w:sz="4" w:space="0" w:color="auto"/>
+            </w:tcBorders>
+          </w:tcPr>
+          <w:p>
+            <w:pPr>
+              <w:jc w:val="center"/>
+              <w:rPr>
+                <w:rFonts w:ascii="Browallia New" w:hAnsi="Browallia New" w:cs="Browallia New"/>
+                <w:sz w:val="24"/>
+                <w:szCs w:val="24"/>
+              </w:rPr>
+            </w:pPr>
+          </w:p>
+        </w:tc>
+        <w:tc>
+          <w:tcPr>
+            <w:tcW w:w="717" w:type="dxa"/>
+            <w:tcBorders>
+              <w:top w:val="single" w:sz="4" w:space="0" w:color="auto"/>
+              <w:bottom w:val="single" w:sz="4" w:space="0" w:color="auto"/>
+            </w:tcBorders>
+          </w:tcPr>
+          <w:p>
+            <w:pPr>
+              <w:rPr>
+                <w:rFonts w:ascii="Browallia New" w:hAnsi="Browallia New" w:cs="Browallia New"/>
+                <w:sz w:val="24"/>
+                <w:szCs w:val="24"/>
+              </w:rPr>
+            </w:pPr>
+          </w:p>
+        </w:tc>
+        <w:tc>
+          <w:tcPr>
+            <w:tcW w:w="5040" w:type="dxa"/>
+            <w:tcBorders>
+              <w:top w:val="single" w:sz="4" w:space="0" w:color="auto"/>
+              <w:bottom w:val="single" w:sz="4" w:space="0" w:color="auto"/>
+            </w:tcBorders>
+          </w:tcPr>
+          <w:p>
+            <w:pPr>
+              <w:rPr>
+                <w:rFonts w:ascii="Browallia New" w:hAnsi="Browallia New" w:cs="Browallia New"/>
+                <w:sz w:val="24"/>
+                <w:szCs w:val="24"/>
+                <w:cs/>
+              </w:rPr>
+            </w:pPr>
+          </w:p>
+        </w:tc>
+        <w:tc>
+          <w:tcPr>
+            <w:tcW w:w="900" w:type="dxa"/>
+            <w:tcBorders>
+              <w:top w:val="single" w:sz="4" w:space="0" w:color="auto"/>
+              <w:bottom w:val="single" w:sz="4" w:space="0" w:color="auto"/>
+            </w:tcBorders>
+          </w:tcPr>
+          <w:p>
+            <w:pPr>
+              <w:jc w:val="center"/>
+              <w:rPr>
+                <w:rFonts w:ascii="Browallia New" w:hAnsi="Browallia New" w:cs="Browallia New"/>
+                <w:sz w:val="24"/>
+                <w:szCs w:val="24"/>
+              </w:rPr>
+            </w:pPr>
+          </w:p>
+        </w:tc>
+        <w:tc>
+          <w:tcPr>
+            <w:tcW w:w="1080" w:type="dxa"/>
+            <w:tcBorders>
+              <w:top w:val="single" w:sz="4" w:space="0" w:color="auto"/>
+              <w:bottom w:val="single" w:sz="4" w:space="0" w:color="auto"/>
+            </w:tcBorders>
+          </w:tcPr>
+          <w:p>
+            <w:pPr>
+              <w:jc w:val="right"/>
+              <w:rPr>
+                <w:rFonts w:ascii="Browallia New" w:hAnsi="Browallia New" w:cs="Browallia New"/>
+                <w:sz w:val="24"/>
+                <w:szCs w:val="24"/>
+              </w:rPr>
+            </w:pPr>
+          </w:p>
+        </w:tc>
+        <w:tc>
+          <w:tcPr>
+            <w:tcW w:w="1511" w:type="dxa"/>
+            <w:tcBorders>
+              <w:top w:val="single" w:sz="4" w:space="0" w:color="auto"/>
+              <w:bottom w:val="single" w:sz="4" w:space="0" w:color="auto"/>
+            </w:tcBorders>
+          </w:tcPr>
+          <w:p>
+            <w:pPr>
+              <w:jc w:val="right"/>
+              <w:rPr>
+                <w:rFonts w:ascii="Browallia New" w:hAnsi="Browallia New" w:cs="Browallia New"/>
+                <w:sz w:val="24"/>
+                <w:szCs w:val="24"/>
+              </w:rPr>
+            </w:pPr>
+          </w:p>
+        </w:tc>
+      </w:tr>
+      <w:tr>
+        <w:tc>
+          <w:tcPr>
+            <w:tcW w:w="817" w:type="dxa"/>
+            <w:tcBorders>
+              <w:top w:val="single" w:sz="4" w:space="0" w:color="auto"/>
+              <w:bottom w:val="single" w:sz="4" w:space="0" w:color="auto"/>
+            </w:tcBorders>
+          </w:tcPr>
+          <w:p>
+            <w:pPr>
+              <w:jc w:val="center"/>
+              <w:rPr>
+                <w:rFonts w:ascii="Browallia New" w:hAnsi="Browallia New" w:cs="Browallia New"/>
+                <w:sz w:val="24"/>
+                <w:szCs w:val="24"/>
+              </w:rPr>
+            </w:pPr>
+            <w:bookmarkStart w:id="0" w:name="_Hlk77771709"/>
+          </w:p>
+        </w:tc>
+        <w:tc>
+          <w:tcPr>
+            <w:tcW w:w="717" w:type="dxa"/>
+            <w:tcBorders>
+              <w:top w:val="single" w:sz="4" w:space="0" w:color="auto"/>
+              <w:bottom w:val="single" w:sz="4" w:space="0" w:color="auto"/>
+            </w:tcBorders>
+          </w:tcPr>
+          <w:p>
+            <w:pPr>
+              <w:rPr>
+                <w:rFonts w:ascii="Browallia New" w:hAnsi="Browallia New" w:cs="Browallia New"/>
+                <w:sz w:val="24"/>
+                <w:szCs w:val="24"/>
+              </w:rPr>
+            </w:pPr>
+          </w:p>
+        </w:tc>
+        <w:tc>
+          <w:tcPr>
+            <w:tcW w:w="5040" w:type="dxa"/>
+            <w:tcBorders>
+              <w:top w:val="single" w:sz="4" w:space="0" w:color="auto"/>
+              <w:bottom w:val="single" w:sz="4" w:space="0" w:color="auto"/>
+            </w:tcBorders>
+          </w:tcPr>
+          <w:p>
+            <w:pPr>
+              <w:rPr>
+                <w:rFonts w:ascii="Browallia New" w:hAnsi="Browallia New" w:cs="Browallia New"/>
+                <w:sz w:val="24"/>
+                <w:szCs w:val="24"/>
+                <w:cs/>
+              </w:rPr>
+            </w:pPr>
+          </w:p>
+        </w:tc>
+        <w:tc>
+          <w:tcPr>
+            <w:tcW w:w="900" w:type="dxa"/>
+            <w:tcBorders>
+              <w:top w:val="single" w:sz="4" w:space="0" w:color="auto"/>
+              <w:bottom w:val="single" w:sz="4" w:space="0" w:color="auto"/>
+            </w:tcBorders>
+          </w:tcPr>
+          <w:p>
+            <w:pPr>
+              <w:jc w:val="center"/>
+              <w:rPr>
+                <w:rFonts w:ascii="Browallia New" w:hAnsi="Browallia New" w:cs="Browallia New"/>
+                <w:sz w:val="24"/>
+                <w:szCs w:val="24"/>
+              </w:rPr>
+            </w:pPr>
+          </w:p>
+        </w:tc>
+        <w:tc>
+          <w:tcPr>
+            <w:tcW w:w="1080" w:type="dxa"/>
+            <w:tcBorders>
+              <w:top w:val="single" w:sz="4" w:space="0" w:color="auto"/>
+              <w:bottom w:val="single" w:sz="4" w:space="0" w:color="auto"/>
+            </w:tcBorders>
+          </w:tcPr>
+          <w:p>
+            <w:pPr>
+              <w:jc w:val="right"/>
+              <w:rPr>
+                <w:rFonts w:ascii="Browallia New" w:hAnsi="Browallia New" w:cs="Browallia New"/>
+                <w:sz w:val="24"/>
+                <w:szCs w:val="24"/>
+              </w:rPr>
+            </w:pPr>
+          </w:p>
+        </w:tc>
+        <w:tc>
+          <w:tcPr>
+            <w:tcW w:w="1511" w:type="dxa"/>
+            <w:tcBorders>
+              <w:top w:val="single" w:sz="4" w:space="0" w:color="auto"/>
+              <w:bottom w:val="single" w:sz="4" w:space="0" w:color="auto"/>
+            </w:tcBorders>
+          </w:tcPr>
+          <w:p>
+            <w:pPr>
+              <w:jc w:val="right"/>
+              <w:rPr>
+                <w:rFonts w:ascii="Browallia New" w:hAnsi="Browallia New" w:cs="Browallia New"/>
+                <w:sz w:val="24"/>
+                <w:szCs w:val="24"/>
+                <w:cs/>
+              </w:rPr>
+            </w:pPr>
+          </w:p>
+        </w:tc>
+      </w:tr>
+      <w:tr>
+        <w:tc>
+          <w:tcPr>
+            <w:tcW w:w="817" w:type="dxa"/>
+            <w:tcBorders>
+              <w:top w:val="single" w:sz="4" w:space="0" w:color="auto"/>
+              <w:bottom w:val="single" w:sz="4" w:space="0" w:color="auto"/>
+            </w:tcBorders>
+          </w:tcPr>
+          <w:p>
+            <w:pPr>
+              <w:rPr>
+                <w:rFonts w:ascii="Browallia New" w:hAnsi="Browallia New" w:cs="Browallia New"/>
+                <w:sz w:val="24"/>
+                <w:szCs w:val="24"/>
+              </w:rPr>
+            </w:pPr>
+          </w:p>
+        </w:tc>
+        <w:tc>
+          <w:tcPr>
+            <w:tcW w:w="717" w:type="dxa"/>
+            <w:tcBorders>
+              <w:top w:val="single" w:sz="4" w:space="0" w:color="auto"/>
+              <w:bottom w:val="single" w:sz="4" w:space="0" w:color="auto"/>
+            </w:tcBorders>
+          </w:tcPr>
+          <w:p>
+            <w:pPr>
+              <w:rPr>
+                <w:rFonts w:ascii="Browallia New" w:hAnsi="Browallia New" w:cs="Browallia New"/>
+                <w:sz w:val="24"/>
+                <w:szCs w:val="24"/>
+              </w:rPr>
+            </w:pPr>
+          </w:p>
+        </w:tc>
+        <w:tc>
+          <w:tcPr>
+            <w:tcW w:w="5040" w:type="dxa"/>
+            <w:tcBorders>
+              <w:top w:val="single" w:sz="4" w:space="0" w:color="auto"/>
+              <w:bottom w:val="single" w:sz="4" w:space="0" w:color="auto"/>
+            </w:tcBorders>
+          </w:tcPr>
+          <w:p>
+            <w:pPr>
+              <w:rPr>
+                <w:rFonts w:ascii="Browallia New" w:hAnsi="Browallia New" w:cs="Browallia New"/>
+                <w:sz w:val="24"/>
+                <w:szCs w:val="24"/>
+                <w:cs/>
+              </w:rPr>
+            </w:pPr>
+          </w:p>
+        </w:tc>
+        <w:tc>
+          <w:tcPr>
+            <w:tcW w:w="900" w:type="dxa"/>
+            <w:tcBorders>
+              <w:top w:val="single" w:sz="4" w:space="0" w:color="auto"/>
+              <w:bottom w:val="single" w:sz="4" w:space="0" w:color="auto"/>
+            </w:tcBorders>
+          </w:tcPr>
+          <w:p>
+            <w:pPr>
+              <w:rPr>
+                <w:rFonts w:ascii="Browallia New" w:hAnsi="Browallia New" w:cs="Browallia New"/>
+                <w:sz w:val="24"/>
+                <w:szCs w:val="24"/>
+              </w:rPr>
+            </w:pPr>
+          </w:p>
+        </w:tc>
+        <w:tc>
+          <w:tcPr>
+            <w:tcW w:w="1080" w:type="dxa"/>
+            <w:tcBorders>
+              <w:top w:val="single" w:sz="4" w:space="0" w:color="auto"/>
+              <w:bottom w:val="single" w:sz="4" w:space="0" w:color="auto"/>
+            </w:tcBorders>
+          </w:tcPr>
+          <w:p>
+            <w:pPr>
+              <w:jc w:val="right"/>
+              <w:rPr>
+                <w:rFonts w:ascii="Browallia New" w:hAnsi="Browallia New" w:cs="Browallia New"/>
+                <w:sz w:val="24"/>
+                <w:szCs w:val="24"/>
+              </w:rPr>
+            </w:pPr>
+          </w:p>
+        </w:tc>
+        <w:tc>
+          <w:tcPr>
+            <w:tcW w:w="1511" w:type="dxa"/>
+            <w:tcBorders>
+              <w:top w:val="single" w:sz="4" w:space="0" w:color="auto"/>
+              <w:bottom w:val="single" w:sz="4" w:space="0" w:color="auto"/>
+            </w:tcBorders>
+          </w:tcPr>
+          <w:p>
+            <w:pPr>
+              <w:rPr>
+                <w:rFonts w:ascii="Browallia New" w:hAnsi="Browallia New" w:cs="Browallia New"/>
+                <w:sz w:val="24"/>
+                <w:szCs w:val="24"/>
+                <w:cs/>
+              </w:rPr>
+            </w:pPr>
+          </w:p>
+        </w:tc>
+      </w:tr>
+      <w:tr>
+        <w:tc>
+          <w:tcPr>
+            <w:tcW w:w="817" w:type="dxa"/>
+            <w:tcBorders>
+              <w:top w:val="single" w:sz="4" w:space="0" w:color="auto"/>
+              <w:bottom w:val="single" w:sz="4" w:space="0" w:color="auto"/>
+            </w:tcBorders>
+          </w:tcPr>
+          <w:p>
+            <w:pPr>
+              <w:rPr>
+                <w:rFonts w:ascii="Browallia New" w:hAnsi="Browallia New" w:cs="Browallia New"/>
+                <w:sz w:val="24"/>
+                <w:szCs w:val="24"/>
+              </w:rPr>
+            </w:pPr>
+          </w:p>
+        </w:tc>
+        <w:tc>
+          <w:tcPr>
+            <w:tcW w:w="717" w:type="dxa"/>
+            <w:tcBorders>
+              <w:top w:val="single" w:sz="4" w:space="0" w:color="auto"/>
+              <w:bottom w:val="single" w:sz="4" w:space="0" w:color="auto"/>
+            </w:tcBorders>
+          </w:tcPr>
+          <w:p>
+            <w:pPr>
+              <w:rPr>
+                <w:rFonts w:ascii="Browallia New" w:hAnsi="Browallia New" w:cs="Browallia New"/>
+                <w:sz w:val="24"/>
+                <w:szCs w:val="24"/>
+              </w:rPr>
+            </w:pPr>
+          </w:p>
+        </w:tc>
+        <w:tc>
+          <w:tcPr>
+            <w:tcW w:w="5040" w:type="dxa"/>
+            <w:tcBorders>
+              <w:top w:val="single" w:sz="4" w:space="0" w:color="auto"/>
+              <w:bottom w:val="single" w:sz="4" w:space="0" w:color="auto"/>
+            </w:tcBorders>
+          </w:tcPr>
+          <w:p>
+            <w:pPr>
+              <w:jc w:val="right"/>
+              <w:rPr>
+                <w:rFonts w:ascii="Browallia New" w:hAnsi="Browallia New" w:cs="Browallia New"/>
+                <w:sz w:val="24"/>
+                <w:szCs w:val="24"/>
+                <w:cs/>
+              </w:rPr>
+            </w:pPr>
+          </w:p>
+        </w:tc>
+        <w:tc>
+          <w:tcPr>
+            <w:tcW w:w="900" w:type="dxa"/>
+            <w:tcBorders>
+              <w:top w:val="single" w:sz="4" w:space="0" w:color="auto"/>
+              <w:bottom w:val="single" w:sz="4" w:space="0" w:color="auto"/>
+            </w:tcBorders>
+          </w:tcPr>
+          <w:p>
+            <w:pPr>
+              <w:rPr>
+                <w:rFonts w:ascii="Browallia New" w:hAnsi="Browallia New" w:cs="Browallia New"/>
+                <w:sz w:val="24"/>
+                <w:szCs w:val="24"/>
+              </w:rPr>
+            </w:pPr>
+          </w:p>
+        </w:tc>
+        <w:tc>
+          <w:tcPr>
+            <w:tcW w:w="1080" w:type="dxa"/>
+            <w:tcBorders>
+              <w:top w:val="single" w:sz="4" w:space="0" w:color="auto"/>
+              <w:bottom w:val="single" w:sz="4" w:space="0" w:color="auto"/>
+            </w:tcBorders>
+          </w:tcPr>
+          <w:p>
+            <w:pPr>
+              <w:jc w:val="right"/>
+              <w:rPr>
+                <w:rFonts w:ascii="Browallia New" w:hAnsi="Browallia New" w:cs="Browallia New"/>
+                <w:sz w:val="24"/>
+                <w:szCs w:val="24"/>
+              </w:rPr>
+            </w:pPr>
+          </w:p>
+        </w:tc>
+        <w:tc>
+          <w:tcPr>
+            <w:tcW w:w="1511" w:type="dxa"/>
+            <w:tcBorders>
+              <w:top w:val="single" w:sz="4" w:space="0" w:color="auto"/>
+              <w:bottom w:val="single" w:sz="4" w:space="0" w:color="auto"/>
+            </w:tcBorders>
+          </w:tcPr>
+          <w:p>
+            <w:pPr>
+              <w:rPr>
+                <w:rFonts w:ascii="Browallia New" w:hAnsi="Browallia New" w:cs="Browallia New"/>
+                <w:sz w:val="24"/>
+                <w:szCs w:val="24"/>
+                <w:cs/>
+              </w:rPr>
+            </w:pPr>
+          </w:p>
+        </w:tc>
+      </w:tr>
+      <w:tr>
+        <w:tc>
+          <w:tcPr>
+            <w:tcW w:w="817" w:type="dxa"/>
+            <w:tcBorders>
+              <w:top w:val="single" w:sz="4" w:space="0" w:color="auto"/>
+              <w:bottom w:val="single" w:sz="4" w:space="0" w:color="auto"/>
+            </w:tcBorders>
+          </w:tcPr>
+          <w:p>
+            <w:pPr>
+              <w:rPr>
+                <w:rFonts w:ascii="Browallia New" w:hAnsi="Browallia New" w:cs="Browallia New"/>
+                <w:sz w:val="24"/>
+                <w:szCs w:val="24"/>
+              </w:rPr>
+            </w:pPr>
+          </w:p>
+        </w:tc>
+        <w:tc>
+          <w:tcPr>
+            <w:tcW w:w="717" w:type="dxa"/>
+            <w:tcBorders>
+              <w:top w:val="single" w:sz="4" w:space="0" w:color="auto"/>
+              <w:bottom w:val="single" w:sz="4" w:space="0" w:color="auto"/>
+            </w:tcBorders>
+          </w:tcPr>
+          <w:p>
+            <w:pPr>
+              <w:rPr>
+                <w:rFonts w:ascii="Browallia New" w:hAnsi="Browallia New" w:cs="Browallia New"/>
+                <w:sz w:val="24"/>
+                <w:szCs w:val="24"/>
+              </w:rPr>
+            </w:pPr>
+          </w:p>
+        </w:tc>
+        <w:tc>
+          <w:tcPr>
+            <w:tcW w:w="5040" w:type="dxa"/>
+            <w:tcBorders>
+              <w:top w:val="single" w:sz="4" w:space="0" w:color="auto"/>
+              <w:bottom w:val="single" w:sz="4" w:space="0" w:color="auto"/>
+            </w:tcBorders>
+          </w:tcPr>
+          <w:p>
+            <w:pPr>
+              <w:jc w:val="right"/>
+              <w:rPr>
+                <w:rFonts w:ascii="Browallia New" w:hAnsi="Browallia New" w:cs="Browallia New"/>
+                <w:sz w:val="24"/>
+                <w:szCs w:val="24"/>
+                <w:cs/>
+              </w:rPr>
+            </w:pPr>
+          </w:p>
+        </w:tc>
+        <w:tc>
+          <w:tcPr>
+            <w:tcW w:w="900" w:type="dxa"/>
+            <w:tcBorders>
+              <w:top w:val="single" w:sz="4" w:space="0" w:color="auto"/>
+              <w:bottom w:val="single" w:sz="4" w:space="0" w:color="auto"/>
+            </w:tcBorders>
+          </w:tcPr>
+          <w:p>
+            <w:pPr>
+              <w:rPr>
+                <w:rFonts w:ascii="Browallia New" w:hAnsi="Browallia New" w:cs="Browallia New"/>
+                <w:sz w:val="24"/>
+                <w:szCs w:val="24"/>
+              </w:rPr>
+            </w:pPr>
+          </w:p>
+        </w:tc>
+        <w:tc>
+          <w:tcPr>
+            <w:tcW w:w="1080" w:type="dxa"/>
+            <w:tcBorders>
+              <w:top w:val="single" w:sz="4" w:space="0" w:color="auto"/>
+              <w:bottom w:val="single" w:sz="4" w:space="0" w:color="auto"/>
+            </w:tcBorders>
+          </w:tcPr>
+          <w:p>
+            <w:pPr>
+              <w:jc w:val="right"/>
+              <w:rPr>
+                <w:rFonts w:ascii="Browallia New" w:hAnsi="Browallia New" w:cs="Browallia New"/>
+                <w:sz w:val="24"/>
+                <w:szCs w:val="24"/>
+              </w:rPr>
+            </w:pPr>
+          </w:p>
+        </w:tc>
+        <w:tc>
+          <w:tcPr>
+            <w:tcW w:w="1511" w:type="dxa"/>
+            <w:tcBorders>
+              <w:top w:val="single" w:sz="4" w:space="0" w:color="auto"/>
+              <w:bottom w:val="single" w:sz="4" w:space="0" w:color="auto"/>
+            </w:tcBorders>
+          </w:tcPr>
+          <w:p>
+            <w:pPr>
+              <w:rPr>
+                <w:rFonts w:ascii="Browallia New" w:hAnsi="Browallia New" w:cs="Browallia New"/>
+                <w:sz w:val="24"/>
+                <w:szCs w:val="24"/>
+                <w:cs/>
               </w:rPr>
             </w:pPr>
           </w:p>
@@ -2229,13 +3092,30 @@
           </w:tcPr>
           <w:p>
             <w:pPr>
+              <w:jc w:val="right"/>
+              <w:rPr>
+                <w:rFonts w:ascii="Browallia New" w:hAnsi="Browallia New" w:cs="Browallia New"/>
+                <w:sz w:val="24"/>
+                <w:szCs w:val="24"/>
+              </w:rPr>
+            </w:pPr>
+            <w:r>
               <w:rPr>
                 <w:rFonts w:ascii="Browallia New" w:hAnsi="Browallia New" w:cs="Browallia New"/>
                 <w:sz w:val="24"/>
                 <w:szCs w:val="24"/>
                 <w:cs/>
               </w:rPr>
-            </w:pPr>
+              <w:t xml:space="preserve">ราคาก่อนรวม </w:t>
+            </w:r>
+            <w:r>
+              <w:rPr>
+                <w:rFonts w:ascii="Browallia New" w:hAnsi="Browallia New" w:cs="Browallia New"/>
+                <w:sz w:val="24"/>
+                <w:szCs w:val="24"/>
+              </w:rPr>
+              <w:t>vat</w:t>
+            </w:r>
           </w:p>
         </w:tc>
         <w:tc>
@@ -2283,6 +3163,7 @@
               <w:top w:val="single" w:sz="4" w:space="0" w:color="auto"/>
               <w:bottom w:val="single" w:sz="4" w:space="0" w:color="auto"/>
             </w:tcBorders>
+            <w:vAlign w:val="center"/>
           </w:tcPr>
           <w:p>
             <w:pPr>
@@ -2293,6 +3174,20 @@
                 <w:szCs w:val="24"/>
               </w:rPr>
             </w:pPr>
+            <w:r>
+              <w:rPr>
+                <w:rFonts w:ascii="Browallia New" w:eastAsia="Browallia New" w:hAnsi="Browallia New"/>
+                <w:sz w:val="24"/>
+              </w:rPr>
+              <w:t>{</w:t>
+            </w:r>
+            <w:r>
+              <w:rPr>
+                <w:rFonts w:ascii="Browallia New" w:eastAsia="Browallia New" w:hAnsi="Browallia New"/>
+                <w:sz w:val="2"/>
+              </w:rPr>
+              <w:t>d.subtotalFormatted}</w:t>
+            </w:r>
           </w:p>
         </w:tc>
       </w:tr>
@@ -2344,12 +3239,30 @@
           </w:tcPr>
           <w:p>
             <w:pPr>
-              <w:rPr>
-                <w:rFonts w:ascii="Browallia New" w:hAnsi="Browallia New" w:cs="Browallia New"/>
-                <w:sz w:val="24"/>
-                <w:szCs w:val="24"/>
-              </w:rPr>
-            </w:pPr>
+              <w:jc w:val="right"/>
+              <w:rPr>
+                <w:rFonts w:ascii="Browallia New" w:hAnsi="Browallia New" w:cs="Browallia New"/>
+                <w:sz w:val="24"/>
+                <w:szCs w:val="24"/>
+              </w:rPr>
+            </w:pPr>
+            <w:r>
+              <w:rPr>
+                <w:rFonts w:ascii="Browallia New" w:hAnsi="Browallia New" w:cs="Browallia New"/>
+                <w:sz w:val="24"/>
+                <w:szCs w:val="24"/>
+                <w:cs/>
+              </w:rPr>
+              <w:t xml:space="preserve">จำนวนภาษีมูลค่าเพิ่ม </w:t>
+            </w:r>
+            <w:r>
+              <w:rPr>
+                <w:rFonts w:ascii="Browallia New" w:hAnsi="Browallia New" w:cs="Browallia New"/>
+                <w:sz w:val="24"/>
+                <w:szCs w:val="24"/>
+              </w:rPr>
+              <w:t>vat 7%</w:t>
+            </w:r>
           </w:p>
         </w:tc>
         <w:tc>
@@ -2407,6 +3320,20 @@
                 <w:szCs w:val="24"/>
               </w:rPr>
             </w:pPr>
+            <w:r>
+              <w:rPr>
+                <w:rFonts w:ascii="Browallia New" w:eastAsia="Browallia New" w:hAnsi="Browallia New"/>
+                <w:sz w:val="24"/>
+              </w:rPr>
+              <w:t>{</w:t>
+            </w:r>
+            <w:r>
+              <w:rPr>
+                <w:rFonts w:ascii="Browallia New" w:eastAsia="Browallia New" w:hAnsi="Browallia New"/>
+                <w:sz w:val="2"/>
+              </w:rPr>
+              <w:t>d.vatAmountFormatted}</w:t>
+            </w:r>
           </w:p>
         </w:tc>
       </w:tr>
@@ -2416,7 +3343,6 @@
             <w:tcW w:w="817" w:type="dxa"/>
             <w:tcBorders>
               <w:top w:val="single" w:sz="4" w:space="0" w:color="auto"/>
-              <w:bottom w:val="single" w:sz="4" w:space="0" w:color="auto"/>
             </w:tcBorders>
           </w:tcPr>
           <w:p>
@@ -2435,7 +3361,6 @@
             <w:tcW w:w="717" w:type="dxa"/>
             <w:tcBorders>
               <w:top w:val="single" w:sz="4" w:space="0" w:color="auto"/>
-              <w:bottom w:val="single" w:sz="4" w:space="0" w:color="auto"/>
             </w:tcBorders>
           </w:tcPr>
           <w:p>
@@ -2453,17 +3378,34 @@
             <w:tcW w:w="5040" w:type="dxa"/>
             <w:tcBorders>
               <w:top w:val="single" w:sz="4" w:space="0" w:color="auto"/>
-              <w:bottom w:val="single" w:sz="4" w:space="0" w:color="auto"/>
-            </w:tcBorders>
-          </w:tcPr>
-          <w:p>
-            <w:pPr>
-              <w:rPr>
-                <w:rFonts w:ascii="Browallia New" w:hAnsi="Browallia New" w:cs="Browallia New"/>
-                <w:sz w:val="24"/>
-                <w:szCs w:val="24"/>
-              </w:rPr>
-            </w:pPr>
+            </w:tcBorders>
+          </w:tcPr>
+          <w:p>
+            <w:pPr>
+              <w:jc w:val="right"/>
+              <w:rPr>
+                <w:rFonts w:ascii="Browallia New" w:hAnsi="Browallia New" w:cs="Browallia New"/>
+                <w:sz w:val="24"/>
+                <w:szCs w:val="24"/>
+              </w:rPr>
+            </w:pPr>
+            <w:r>
+              <w:rPr>
+                <w:rFonts w:ascii="Browallia New" w:hAnsi="Browallia New" w:cs="Browallia New"/>
+                <w:sz w:val="24"/>
+                <w:szCs w:val="24"/>
+                <w:cs/>
+              </w:rPr>
+              <w:t xml:space="preserve">ราคารวม </w:t>
+            </w:r>
+            <w:r>
+              <w:rPr>
+                <w:rFonts w:ascii="Browallia New" w:hAnsi="Browallia New" w:cs="Browallia New"/>
+                <w:sz w:val="24"/>
+                <w:szCs w:val="24"/>
+              </w:rPr>
+              <w:t>vat</w:t>
+            </w:r>
           </w:p>
         </w:tc>
         <w:tc>
@@ -2471,7 +3413,6 @@
             <w:tcW w:w="900" w:type="dxa"/>
             <w:tcBorders>
               <w:top w:val="single" w:sz="4" w:space="0" w:color="auto"/>
-              <w:bottom w:val="single" w:sz="4" w:space="0" w:color="auto"/>
             </w:tcBorders>
           </w:tcPr>
           <w:p>
@@ -2490,7 +3431,6 @@
             <w:tcW w:w="1080" w:type="dxa"/>
             <w:tcBorders>
               <w:top w:val="single" w:sz="4" w:space="0" w:color="auto"/>
-              <w:bottom w:val="single" w:sz="4" w:space="0" w:color="auto"/>
             </w:tcBorders>
           </w:tcPr>
           <w:p>
@@ -2509,7 +3449,6 @@
             <w:tcW w:w="1511" w:type="dxa"/>
             <w:tcBorders>
               <w:top w:val="single" w:sz="4" w:space="0" w:color="auto"/>
-              <w:bottom w:val="single" w:sz="4" w:space="0" w:color="auto"/>
             </w:tcBorders>
           </w:tcPr>
           <w:p>
@@ -2521,1009 +3460,16 @@
                 <w:szCs w:val="24"/>
               </w:rPr>
             </w:pPr>
-          </w:p>
-        </w:tc>
-      </w:tr>
-      <w:tr>
-        <w:tc>
-          <w:tcPr>
-            <w:tcW w:w="817" w:type="dxa"/>
-            <w:tcBorders>
-              <w:top w:val="single" w:sz="4" w:space="0" w:color="auto"/>
-              <w:bottom w:val="single" w:sz="4" w:space="0" w:color="auto"/>
-            </w:tcBorders>
-          </w:tcPr>
-          <w:p>
-            <w:pPr>
-              <w:jc w:val="center"/>
-              <w:rPr>
-                <w:rFonts w:ascii="Browallia New" w:hAnsi="Browallia New" w:cs="Browallia New"/>
-                <w:sz w:val="24"/>
-                <w:szCs w:val="24"/>
-              </w:rPr>
-            </w:pPr>
-          </w:p>
-        </w:tc>
-        <w:tc>
-          <w:tcPr>
-            <w:tcW w:w="717" w:type="dxa"/>
-            <w:tcBorders>
-              <w:top w:val="single" w:sz="4" w:space="0" w:color="auto"/>
-              <w:bottom w:val="single" w:sz="4" w:space="0" w:color="auto"/>
-            </w:tcBorders>
-          </w:tcPr>
-          <w:p>
-            <w:pPr>
-              <w:rPr>
-                <w:rFonts w:ascii="Browallia New" w:hAnsi="Browallia New" w:cs="Browallia New"/>
-                <w:sz w:val="24"/>
-                <w:szCs w:val="24"/>
-              </w:rPr>
-            </w:pPr>
-          </w:p>
-        </w:tc>
-        <w:tc>
-          <w:tcPr>
-            <w:tcW w:w="5040" w:type="dxa"/>
-            <w:tcBorders>
-              <w:top w:val="single" w:sz="4" w:space="0" w:color="auto"/>
-              <w:bottom w:val="single" w:sz="4" w:space="0" w:color="auto"/>
-            </w:tcBorders>
-          </w:tcPr>
-          <w:p>
-            <w:pPr>
-              <w:rPr>
-                <w:rFonts w:ascii="Browallia New" w:hAnsi="Browallia New" w:cs="Browallia New"/>
-                <w:sz w:val="24"/>
-                <w:szCs w:val="24"/>
-                <w:cs/>
-              </w:rPr>
-            </w:pPr>
-          </w:p>
-        </w:tc>
-        <w:tc>
-          <w:tcPr>
-            <w:tcW w:w="900" w:type="dxa"/>
-            <w:tcBorders>
-              <w:top w:val="single" w:sz="4" w:space="0" w:color="auto"/>
-              <w:bottom w:val="single" w:sz="4" w:space="0" w:color="auto"/>
-            </w:tcBorders>
-          </w:tcPr>
-          <w:p>
-            <w:pPr>
-              <w:jc w:val="center"/>
-              <w:rPr>
-                <w:rFonts w:ascii="Browallia New" w:hAnsi="Browallia New" w:cs="Browallia New"/>
-                <w:sz w:val="24"/>
-                <w:szCs w:val="24"/>
-              </w:rPr>
-            </w:pPr>
-          </w:p>
-        </w:tc>
-        <w:tc>
-          <w:tcPr>
-            <w:tcW w:w="1080" w:type="dxa"/>
-            <w:tcBorders>
-              <w:top w:val="single" w:sz="4" w:space="0" w:color="auto"/>
-              <w:bottom w:val="single" w:sz="4" w:space="0" w:color="auto"/>
-            </w:tcBorders>
-          </w:tcPr>
-          <w:p>
-            <w:pPr>
-              <w:jc w:val="right"/>
-              <w:rPr>
-                <w:rFonts w:ascii="Browallia New" w:hAnsi="Browallia New" w:cs="Browallia New"/>
-                <w:sz w:val="24"/>
-                <w:szCs w:val="24"/>
-              </w:rPr>
-            </w:pPr>
-          </w:p>
-        </w:tc>
-        <w:tc>
-          <w:tcPr>
-            <w:tcW w:w="1511" w:type="dxa"/>
-            <w:tcBorders>
-              <w:top w:val="single" w:sz="4" w:space="0" w:color="auto"/>
-              <w:bottom w:val="single" w:sz="4" w:space="0" w:color="auto"/>
-            </w:tcBorders>
-          </w:tcPr>
-          <w:p>
-            <w:pPr>
-              <w:jc w:val="right"/>
-              <w:rPr>
-                <w:rFonts w:ascii="Browallia New" w:hAnsi="Browallia New" w:cs="Browallia New"/>
-                <w:sz w:val="24"/>
-                <w:szCs w:val="24"/>
-              </w:rPr>
-            </w:pPr>
-          </w:p>
-        </w:tc>
-      </w:tr>
-      <w:tr>
-        <w:tc>
-          <w:tcPr>
-            <w:tcW w:w="817" w:type="dxa"/>
-            <w:tcBorders>
-              <w:top w:val="single" w:sz="4" w:space="0" w:color="auto"/>
-              <w:bottom w:val="single" w:sz="4" w:space="0" w:color="auto"/>
-            </w:tcBorders>
-          </w:tcPr>
-          <w:p>
-            <w:pPr>
-              <w:jc w:val="center"/>
-              <w:rPr>
-                <w:rFonts w:ascii="Browallia New" w:hAnsi="Browallia New" w:cs="Browallia New"/>
-                <w:sz w:val="24"/>
-                <w:szCs w:val="24"/>
-              </w:rPr>
-            </w:pPr>
-            <w:bookmarkStart w:id="1" w:name="_Hlk77771709"/>
-          </w:p>
-        </w:tc>
-        <w:tc>
-          <w:tcPr>
-            <w:tcW w:w="717" w:type="dxa"/>
-            <w:tcBorders>
-              <w:top w:val="single" w:sz="4" w:space="0" w:color="auto"/>
-              <w:bottom w:val="single" w:sz="4" w:space="0" w:color="auto"/>
-            </w:tcBorders>
-          </w:tcPr>
-          <w:p>
-            <w:pPr>
-              <w:rPr>
-                <w:rFonts w:ascii="Browallia New" w:hAnsi="Browallia New" w:cs="Browallia New"/>
-                <w:sz w:val="24"/>
-                <w:szCs w:val="24"/>
-              </w:rPr>
-            </w:pPr>
-          </w:p>
-        </w:tc>
-        <w:tc>
-          <w:tcPr>
-            <w:tcW w:w="5040" w:type="dxa"/>
-            <w:tcBorders>
-              <w:top w:val="single" w:sz="4" w:space="0" w:color="auto"/>
-              <w:bottom w:val="single" w:sz="4" w:space="0" w:color="auto"/>
-            </w:tcBorders>
-          </w:tcPr>
-          <w:p>
-            <w:pPr>
-              <w:rPr>
-                <w:rFonts w:ascii="Browallia New" w:hAnsi="Browallia New" w:cs="Browallia New"/>
-                <w:sz w:val="24"/>
-                <w:szCs w:val="24"/>
-                <w:cs/>
-              </w:rPr>
-            </w:pPr>
-          </w:p>
-        </w:tc>
-        <w:tc>
-          <w:tcPr>
-            <w:tcW w:w="900" w:type="dxa"/>
-            <w:tcBorders>
-              <w:top w:val="single" w:sz="4" w:space="0" w:color="auto"/>
-              <w:bottom w:val="single" w:sz="4" w:space="0" w:color="auto"/>
-            </w:tcBorders>
-          </w:tcPr>
-          <w:p>
-            <w:pPr>
-              <w:jc w:val="center"/>
-              <w:rPr>
-                <w:rFonts w:ascii="Browallia New" w:hAnsi="Browallia New" w:cs="Browallia New"/>
-                <w:sz w:val="24"/>
-                <w:szCs w:val="24"/>
-              </w:rPr>
-            </w:pPr>
-          </w:p>
-        </w:tc>
-        <w:tc>
-          <w:tcPr>
-            <w:tcW w:w="1080" w:type="dxa"/>
-            <w:tcBorders>
-              <w:top w:val="single" w:sz="4" w:space="0" w:color="auto"/>
-              <w:bottom w:val="single" w:sz="4" w:space="0" w:color="auto"/>
-            </w:tcBorders>
-          </w:tcPr>
-          <w:p>
-            <w:pPr>
-              <w:jc w:val="right"/>
-              <w:rPr>
-                <w:rFonts w:ascii="Browallia New" w:hAnsi="Browallia New" w:cs="Browallia New"/>
-                <w:sz w:val="24"/>
-                <w:szCs w:val="24"/>
-              </w:rPr>
-            </w:pPr>
-          </w:p>
-        </w:tc>
-        <w:tc>
-          <w:tcPr>
-            <w:tcW w:w="1511" w:type="dxa"/>
-            <w:tcBorders>
-              <w:top w:val="single" w:sz="4" w:space="0" w:color="auto"/>
-              <w:bottom w:val="single" w:sz="4" w:space="0" w:color="auto"/>
-            </w:tcBorders>
-          </w:tcPr>
-          <w:p>
-            <w:pPr>
-              <w:jc w:val="right"/>
-              <w:rPr>
-                <w:rFonts w:ascii="Browallia New" w:hAnsi="Browallia New" w:cs="Browallia New"/>
-                <w:sz w:val="24"/>
-                <w:szCs w:val="24"/>
-                <w:cs/>
-              </w:rPr>
-            </w:pPr>
-          </w:p>
-        </w:tc>
-      </w:tr>
-      <w:tr>
-        <w:tc>
-          <w:tcPr>
-            <w:tcW w:w="817" w:type="dxa"/>
-            <w:tcBorders>
-              <w:top w:val="single" w:sz="4" w:space="0" w:color="auto"/>
-              <w:bottom w:val="single" w:sz="4" w:space="0" w:color="auto"/>
-            </w:tcBorders>
-          </w:tcPr>
-          <w:p>
-            <w:pPr>
-              <w:rPr>
-                <w:rFonts w:ascii="Browallia New" w:hAnsi="Browallia New" w:cs="Browallia New"/>
-                <w:sz w:val="24"/>
-                <w:szCs w:val="24"/>
-              </w:rPr>
-            </w:pPr>
-          </w:p>
-        </w:tc>
-        <w:tc>
-          <w:tcPr>
-            <w:tcW w:w="717" w:type="dxa"/>
-            <w:tcBorders>
-              <w:top w:val="single" w:sz="4" w:space="0" w:color="auto"/>
-              <w:bottom w:val="single" w:sz="4" w:space="0" w:color="auto"/>
-            </w:tcBorders>
-          </w:tcPr>
-          <w:p>
-            <w:pPr>
-              <w:rPr>
-                <w:rFonts w:ascii="Browallia New" w:hAnsi="Browallia New" w:cs="Browallia New"/>
-                <w:sz w:val="24"/>
-                <w:szCs w:val="24"/>
-              </w:rPr>
-            </w:pPr>
-          </w:p>
-        </w:tc>
-        <w:tc>
-          <w:tcPr>
-            <w:tcW w:w="5040" w:type="dxa"/>
-            <w:tcBorders>
-              <w:top w:val="single" w:sz="4" w:space="0" w:color="auto"/>
-              <w:bottom w:val="single" w:sz="4" w:space="0" w:color="auto"/>
-            </w:tcBorders>
-          </w:tcPr>
-          <w:p>
-            <w:pPr>
-              <w:rPr>
-                <w:rFonts w:ascii="Browallia New" w:hAnsi="Browallia New" w:cs="Browallia New"/>
-                <w:sz w:val="24"/>
-                <w:szCs w:val="24"/>
-                <w:cs/>
-              </w:rPr>
-            </w:pPr>
-          </w:p>
-        </w:tc>
-        <w:tc>
-          <w:tcPr>
-            <w:tcW w:w="900" w:type="dxa"/>
-            <w:tcBorders>
-              <w:top w:val="single" w:sz="4" w:space="0" w:color="auto"/>
-              <w:bottom w:val="single" w:sz="4" w:space="0" w:color="auto"/>
-            </w:tcBorders>
-          </w:tcPr>
-          <w:p>
-            <w:pPr>
-              <w:rPr>
-                <w:rFonts w:ascii="Browallia New" w:hAnsi="Browallia New" w:cs="Browallia New"/>
-                <w:sz w:val="24"/>
-                <w:szCs w:val="24"/>
-              </w:rPr>
-            </w:pPr>
-          </w:p>
-        </w:tc>
-        <w:tc>
-          <w:tcPr>
-            <w:tcW w:w="1080" w:type="dxa"/>
-            <w:tcBorders>
-              <w:top w:val="single" w:sz="4" w:space="0" w:color="auto"/>
-              <w:bottom w:val="single" w:sz="4" w:space="0" w:color="auto"/>
-            </w:tcBorders>
-          </w:tcPr>
-          <w:p>
-            <w:pPr>
-              <w:jc w:val="right"/>
-              <w:rPr>
-                <w:rFonts w:ascii="Browallia New" w:hAnsi="Browallia New" w:cs="Browallia New"/>
-                <w:sz w:val="24"/>
-                <w:szCs w:val="24"/>
-              </w:rPr>
-            </w:pPr>
-          </w:p>
-        </w:tc>
-        <w:tc>
-          <w:tcPr>
-            <w:tcW w:w="1511" w:type="dxa"/>
-            <w:tcBorders>
-              <w:top w:val="single" w:sz="4" w:space="0" w:color="auto"/>
-              <w:bottom w:val="single" w:sz="4" w:space="0" w:color="auto"/>
-            </w:tcBorders>
-          </w:tcPr>
-          <w:p>
-            <w:pPr>
-              <w:rPr>
-                <w:rFonts w:ascii="Browallia New" w:hAnsi="Browallia New" w:cs="Browallia New"/>
-                <w:sz w:val="24"/>
-                <w:szCs w:val="24"/>
-                <w:cs/>
-              </w:rPr>
-            </w:pPr>
-          </w:p>
-        </w:tc>
-      </w:tr>
-      <w:tr>
-        <w:tc>
-          <w:tcPr>
-            <w:tcW w:w="817" w:type="dxa"/>
-            <w:tcBorders>
-              <w:top w:val="single" w:sz="4" w:space="0" w:color="auto"/>
-              <w:bottom w:val="single" w:sz="4" w:space="0" w:color="auto"/>
-            </w:tcBorders>
-          </w:tcPr>
-          <w:p>
-            <w:pPr>
-              <w:rPr>
-                <w:rFonts w:ascii="Browallia New" w:hAnsi="Browallia New" w:cs="Browallia New"/>
-                <w:sz w:val="24"/>
-                <w:szCs w:val="24"/>
-              </w:rPr>
-            </w:pPr>
-          </w:p>
-        </w:tc>
-        <w:tc>
-          <w:tcPr>
-            <w:tcW w:w="717" w:type="dxa"/>
-            <w:tcBorders>
-              <w:top w:val="single" w:sz="4" w:space="0" w:color="auto"/>
-              <w:bottom w:val="single" w:sz="4" w:space="0" w:color="auto"/>
-            </w:tcBorders>
-          </w:tcPr>
-          <w:p>
-            <w:pPr>
-              <w:rPr>
-                <w:rFonts w:ascii="Browallia New" w:hAnsi="Browallia New" w:cs="Browallia New"/>
-                <w:sz w:val="24"/>
-                <w:szCs w:val="24"/>
-              </w:rPr>
-            </w:pPr>
-          </w:p>
-        </w:tc>
-        <w:tc>
-          <w:tcPr>
-            <w:tcW w:w="5040" w:type="dxa"/>
-            <w:tcBorders>
-              <w:top w:val="single" w:sz="4" w:space="0" w:color="auto"/>
-              <w:bottom w:val="single" w:sz="4" w:space="0" w:color="auto"/>
-            </w:tcBorders>
-          </w:tcPr>
-          <w:p>
-            <w:pPr>
-              <w:jc w:val="right"/>
-              <w:rPr>
-                <w:rFonts w:ascii="Browallia New" w:hAnsi="Browallia New" w:cs="Browallia New"/>
-                <w:sz w:val="24"/>
-                <w:szCs w:val="24"/>
-                <w:cs/>
-              </w:rPr>
-            </w:pPr>
-          </w:p>
-        </w:tc>
-        <w:tc>
-          <w:tcPr>
-            <w:tcW w:w="900" w:type="dxa"/>
-            <w:tcBorders>
-              <w:top w:val="single" w:sz="4" w:space="0" w:color="auto"/>
-              <w:bottom w:val="single" w:sz="4" w:space="0" w:color="auto"/>
-            </w:tcBorders>
-          </w:tcPr>
-          <w:p>
-            <w:pPr>
-              <w:rPr>
-                <w:rFonts w:ascii="Browallia New" w:hAnsi="Browallia New" w:cs="Browallia New"/>
-                <w:sz w:val="24"/>
-                <w:szCs w:val="24"/>
-              </w:rPr>
-            </w:pPr>
-          </w:p>
-        </w:tc>
-        <w:tc>
-          <w:tcPr>
-            <w:tcW w:w="1080" w:type="dxa"/>
-            <w:tcBorders>
-              <w:top w:val="single" w:sz="4" w:space="0" w:color="auto"/>
-              <w:bottom w:val="single" w:sz="4" w:space="0" w:color="auto"/>
-            </w:tcBorders>
-          </w:tcPr>
-          <w:p>
-            <w:pPr>
-              <w:jc w:val="right"/>
-              <w:rPr>
-                <w:rFonts w:ascii="Browallia New" w:hAnsi="Browallia New" w:cs="Browallia New"/>
-                <w:sz w:val="24"/>
-                <w:szCs w:val="24"/>
-              </w:rPr>
-            </w:pPr>
-          </w:p>
-        </w:tc>
-        <w:tc>
-          <w:tcPr>
-            <w:tcW w:w="1511" w:type="dxa"/>
-            <w:tcBorders>
-              <w:top w:val="single" w:sz="4" w:space="0" w:color="auto"/>
-              <w:bottom w:val="single" w:sz="4" w:space="0" w:color="auto"/>
-            </w:tcBorders>
-          </w:tcPr>
-          <w:p>
-            <w:pPr>
-              <w:rPr>
-                <w:rFonts w:ascii="Browallia New" w:hAnsi="Browallia New" w:cs="Browallia New"/>
-                <w:sz w:val="24"/>
-                <w:szCs w:val="24"/>
-                <w:cs/>
-              </w:rPr>
-            </w:pPr>
-          </w:p>
-        </w:tc>
-      </w:tr>
-      <w:tr>
-        <w:tc>
-          <w:tcPr>
-            <w:tcW w:w="817" w:type="dxa"/>
-            <w:tcBorders>
-              <w:top w:val="single" w:sz="4" w:space="0" w:color="auto"/>
-              <w:bottom w:val="single" w:sz="4" w:space="0" w:color="auto"/>
-            </w:tcBorders>
-          </w:tcPr>
-          <w:p>
-            <w:pPr>
-              <w:rPr>
-                <w:rFonts w:ascii="Browallia New" w:hAnsi="Browallia New" w:cs="Browallia New"/>
-                <w:sz w:val="24"/>
-                <w:szCs w:val="24"/>
-              </w:rPr>
-            </w:pPr>
-          </w:p>
-        </w:tc>
-        <w:tc>
-          <w:tcPr>
-            <w:tcW w:w="717" w:type="dxa"/>
-            <w:tcBorders>
-              <w:top w:val="single" w:sz="4" w:space="0" w:color="auto"/>
-              <w:bottom w:val="single" w:sz="4" w:space="0" w:color="auto"/>
-            </w:tcBorders>
-          </w:tcPr>
-          <w:p>
-            <w:pPr>
-              <w:rPr>
-                <w:rFonts w:ascii="Browallia New" w:hAnsi="Browallia New" w:cs="Browallia New"/>
-                <w:sz w:val="24"/>
-                <w:szCs w:val="24"/>
-              </w:rPr>
-            </w:pPr>
-          </w:p>
-        </w:tc>
-        <w:tc>
-          <w:tcPr>
-            <w:tcW w:w="5040" w:type="dxa"/>
-            <w:tcBorders>
-              <w:top w:val="single" w:sz="4" w:space="0" w:color="auto"/>
-              <w:bottom w:val="single" w:sz="4" w:space="0" w:color="auto"/>
-            </w:tcBorders>
-          </w:tcPr>
-          <w:p>
-            <w:pPr>
-              <w:jc w:val="right"/>
-              <w:rPr>
-                <w:rFonts w:ascii="Browallia New" w:hAnsi="Browallia New" w:cs="Browallia New"/>
-                <w:sz w:val="24"/>
-                <w:szCs w:val="24"/>
-                <w:cs/>
-              </w:rPr>
-            </w:pPr>
-          </w:p>
-        </w:tc>
-        <w:tc>
-          <w:tcPr>
-            <w:tcW w:w="900" w:type="dxa"/>
-            <w:tcBorders>
-              <w:top w:val="single" w:sz="4" w:space="0" w:color="auto"/>
-              <w:bottom w:val="single" w:sz="4" w:space="0" w:color="auto"/>
-            </w:tcBorders>
-          </w:tcPr>
-          <w:p>
-            <w:pPr>
-              <w:rPr>
-                <w:rFonts w:ascii="Browallia New" w:hAnsi="Browallia New" w:cs="Browallia New"/>
-                <w:sz w:val="24"/>
-                <w:szCs w:val="24"/>
-              </w:rPr>
-            </w:pPr>
-          </w:p>
-        </w:tc>
-        <w:tc>
-          <w:tcPr>
-            <w:tcW w:w="1080" w:type="dxa"/>
-            <w:tcBorders>
-              <w:top w:val="single" w:sz="4" w:space="0" w:color="auto"/>
-              <w:bottom w:val="single" w:sz="4" w:space="0" w:color="auto"/>
-            </w:tcBorders>
-          </w:tcPr>
-          <w:p>
-            <w:pPr>
-              <w:jc w:val="right"/>
-              <w:rPr>
-                <w:rFonts w:ascii="Browallia New" w:hAnsi="Browallia New" w:cs="Browallia New"/>
-                <w:sz w:val="24"/>
-                <w:szCs w:val="24"/>
-              </w:rPr>
-            </w:pPr>
-          </w:p>
-        </w:tc>
-        <w:tc>
-          <w:tcPr>
-            <w:tcW w:w="1511" w:type="dxa"/>
-            <w:tcBorders>
-              <w:top w:val="single" w:sz="4" w:space="0" w:color="auto"/>
-              <w:bottom w:val="single" w:sz="4" w:space="0" w:color="auto"/>
-            </w:tcBorders>
-          </w:tcPr>
-          <w:p>
-            <w:pPr>
-              <w:rPr>
-                <w:rFonts w:ascii="Browallia New" w:hAnsi="Browallia New" w:cs="Browallia New"/>
-                <w:sz w:val="24"/>
-                <w:szCs w:val="24"/>
-                <w:cs/>
-              </w:rPr>
-            </w:pPr>
-          </w:p>
-        </w:tc>
-      </w:tr>
-      <w:bookmarkEnd w:id="1"/>
-      <w:tr>
-        <w:tc>
-          <w:tcPr>
-            <w:tcW w:w="817" w:type="dxa"/>
-            <w:tcBorders>
-              <w:top w:val="single" w:sz="4" w:space="0" w:color="auto"/>
-              <w:bottom w:val="single" w:sz="4" w:space="0" w:color="auto"/>
-            </w:tcBorders>
-          </w:tcPr>
-          <w:p>
-            <w:pPr>
-              <w:jc w:val="center"/>
-              <w:rPr>
-                <w:rFonts w:ascii="Browallia New" w:hAnsi="Browallia New" w:cs="Browallia New"/>
-                <w:sz w:val="24"/>
-                <w:szCs w:val="24"/>
-              </w:rPr>
-            </w:pPr>
-          </w:p>
-        </w:tc>
-        <w:tc>
-          <w:tcPr>
-            <w:tcW w:w="717" w:type="dxa"/>
-            <w:tcBorders>
-              <w:top w:val="single" w:sz="4" w:space="0" w:color="auto"/>
-              <w:bottom w:val="single" w:sz="4" w:space="0" w:color="auto"/>
-            </w:tcBorders>
-          </w:tcPr>
-          <w:p>
-            <w:pPr>
-              <w:rPr>
-                <w:rFonts w:ascii="Browallia New" w:hAnsi="Browallia New" w:cs="Browallia New"/>
-                <w:sz w:val="24"/>
-                <w:szCs w:val="24"/>
-              </w:rPr>
-            </w:pPr>
-          </w:p>
-        </w:tc>
-        <w:tc>
-          <w:tcPr>
-            <w:tcW w:w="5040" w:type="dxa"/>
-            <w:tcBorders>
-              <w:top w:val="single" w:sz="4" w:space="0" w:color="auto"/>
-              <w:bottom w:val="single" w:sz="4" w:space="0" w:color="auto"/>
-            </w:tcBorders>
-          </w:tcPr>
-          <w:p>
-            <w:pPr>
-              <w:jc w:val="right"/>
-              <w:rPr>
-                <w:rFonts w:ascii="Browallia New" w:hAnsi="Browallia New" w:cs="Browallia New"/>
-                <w:sz w:val="24"/>
-                <w:szCs w:val="24"/>
-              </w:rPr>
-            </w:pPr>
-            <w:r>
-              <w:rPr>
-                <w:rFonts w:ascii="Browallia New" w:hAnsi="Browallia New" w:cs="Browallia New"/>
-                <w:sz w:val="24"/>
-                <w:szCs w:val="24"/>
-                <w:cs/>
-              </w:rPr>
-              <w:t xml:space="preserve">ราคาก่อนรวม </w:t>
-            </w:r>
-            <w:r>
-              <w:rPr>
-                <w:rFonts w:ascii="Browallia New" w:hAnsi="Browallia New" w:cs="Browallia New"/>
-                <w:sz w:val="24"/>
-                <w:szCs w:val="24"/>
-              </w:rPr>
-              <w:t>vat</w:t>
-            </w:r>
-          </w:p>
-        </w:tc>
-        <w:tc>
-          <w:tcPr>
-            <w:tcW w:w="900" w:type="dxa"/>
-            <w:tcBorders>
-              <w:top w:val="single" w:sz="4" w:space="0" w:color="auto"/>
-              <w:bottom w:val="single" w:sz="4" w:space="0" w:color="auto"/>
-            </w:tcBorders>
-          </w:tcPr>
-          <w:p>
-            <w:pPr>
-              <w:jc w:val="center"/>
-              <w:rPr>
-                <w:rFonts w:ascii="Browallia New" w:hAnsi="Browallia New" w:cs="Browallia New"/>
-                <w:sz w:val="24"/>
-                <w:szCs w:val="24"/>
-              </w:rPr>
-            </w:pPr>
-          </w:p>
-        </w:tc>
-        <w:tc>
-          <w:tcPr>
-            <w:tcW w:w="1080" w:type="dxa"/>
-            <w:tcBorders>
-              <w:top w:val="single" w:sz="4" w:space="0" w:color="auto"/>
-              <w:bottom w:val="single" w:sz="4" w:space="0" w:color="auto"/>
-            </w:tcBorders>
-          </w:tcPr>
-          <w:p>
-            <w:pPr>
-              <w:jc w:val="right"/>
-              <w:rPr>
-                <w:rFonts w:ascii="Browallia New" w:hAnsi="Browallia New" w:cs="Browallia New"/>
-                <w:sz w:val="24"/>
-                <w:szCs w:val="24"/>
-              </w:rPr>
-            </w:pPr>
-          </w:p>
-        </w:tc>
-        <w:tc>
-          <w:tcPr>
-            <w:tcW w:w="1511" w:type="dxa"/>
-            <w:tcBorders>
-              <w:top w:val="single" w:sz="4" w:space="0" w:color="auto"/>
-              <w:bottom w:val="single" w:sz="4" w:space="0" w:color="auto"/>
-            </w:tcBorders>
-            <w:vAlign w:val="center"/>
-          </w:tcPr>
-          <w:p>
-            <w:pPr>
-              <w:jc w:val="right"/>
-              <w:rPr>
-                <w:rFonts w:ascii="Browallia New" w:hAnsi="Browallia New" w:cs="Browallia New"/>
-                <w:sz w:val="24"/>
-                <w:szCs w:val="24"/>
-              </w:rPr>
-            </w:pPr>
-            <w:r>
-              <w:rPr>
-                <w:rFonts w:ascii="Browallia New" w:hAnsi="Browallia New" w:eastAsia="Browallia New"/>
+            <w:r>
+              <w:rPr>
+                <w:rFonts w:ascii="Browallia New" w:eastAsia="Browallia New" w:hAnsi="Browallia New"/>
                 <w:sz w:val="24"/>
               </w:rPr>
               <w:t>{</w:t>
             </w:r>
             <w:r>
               <w:rPr>
-                <w:rFonts w:ascii="Browallia New" w:hAnsi="Browallia New" w:eastAsia="Browallia New"/>
-                <w:sz w:val="2"/>
-              </w:rPr>
-              <w:t>d.subtotalFormatted}</w:t>
-            </w:r>
-          </w:p>
-        </w:tc>
-      </w:tr>
-      <w:tr>
-        <w:tc>
-          <w:tcPr>
-            <w:tcW w:w="817" w:type="dxa"/>
-            <w:tcBorders>
-              <w:top w:val="single" w:sz="4" w:space="0" w:color="auto"/>
-              <w:bottom w:val="single" w:sz="4" w:space="0" w:color="auto"/>
-            </w:tcBorders>
-          </w:tcPr>
-          <w:p>
-            <w:pPr>
-              <w:jc w:val="center"/>
-              <w:rPr>
-                <w:rFonts w:ascii="Browallia New" w:hAnsi="Browallia New" w:cs="Browallia New"/>
-                <w:sz w:val="24"/>
-                <w:szCs w:val="24"/>
-              </w:rPr>
-            </w:pPr>
-          </w:p>
-        </w:tc>
-        <w:tc>
-          <w:tcPr>
-            <w:tcW w:w="717" w:type="dxa"/>
-            <w:tcBorders>
-              <w:top w:val="single" w:sz="4" w:space="0" w:color="auto"/>
-              <w:bottom w:val="single" w:sz="4" w:space="0" w:color="auto"/>
-            </w:tcBorders>
-          </w:tcPr>
-          <w:p>
-            <w:pPr>
-              <w:rPr>
-                <w:rFonts w:ascii="Browallia New" w:hAnsi="Browallia New" w:cs="Browallia New"/>
-                <w:sz w:val="24"/>
-                <w:szCs w:val="24"/>
-              </w:rPr>
-            </w:pPr>
-          </w:p>
-        </w:tc>
-        <w:tc>
-          <w:tcPr>
-            <w:tcW w:w="5040" w:type="dxa"/>
-            <w:tcBorders>
-              <w:top w:val="single" w:sz="4" w:space="0" w:color="auto"/>
-              <w:bottom w:val="single" w:sz="4" w:space="0" w:color="auto"/>
-            </w:tcBorders>
-          </w:tcPr>
-          <w:p>
-            <w:pPr>
-              <w:jc w:val="right"/>
-              <w:rPr>
-                <w:rFonts w:ascii="Browallia New" w:hAnsi="Browallia New" w:cs="Browallia New"/>
-                <w:sz w:val="24"/>
-                <w:szCs w:val="24"/>
-              </w:rPr>
-            </w:pPr>
-            <w:r>
-              <w:rPr>
-                <w:rFonts w:ascii="Browallia New" w:hAnsi="Browallia New" w:cs="Browallia New"/>
-                <w:sz w:val="24"/>
-                <w:szCs w:val="24"/>
-                <w:cs/>
-              </w:rPr>
-              <w:t xml:space="preserve">จำนวนภาษีมูลค่าเพิ่ม </w:t>
-            </w:r>
-            <w:r>
-              <w:rPr>
-                <w:rFonts w:ascii="Browallia New" w:hAnsi="Browallia New" w:cs="Browallia New"/>
-                <w:sz w:val="24"/>
-                <w:szCs w:val="24"/>
-              </w:rPr>
-              <w:t>vat 7%</w:t>
-            </w:r>
-          </w:p>
-        </w:tc>
-        <w:tc>
-          <w:tcPr>
-            <w:tcW w:w="900" w:type="dxa"/>
-            <w:tcBorders>
-              <w:top w:val="single" w:sz="4" w:space="0" w:color="auto"/>
-              <w:bottom w:val="single" w:sz="4" w:space="0" w:color="auto"/>
-            </w:tcBorders>
-          </w:tcPr>
-          <w:p>
-            <w:pPr>
-              <w:jc w:val="center"/>
-              <w:rPr>
-                <w:rFonts w:ascii="Browallia New" w:hAnsi="Browallia New" w:cs="Browallia New"/>
-                <w:sz w:val="24"/>
-                <w:szCs w:val="24"/>
-              </w:rPr>
-            </w:pPr>
-          </w:p>
-        </w:tc>
-        <w:tc>
-          <w:tcPr>
-            <w:tcW w:w="1080" w:type="dxa"/>
-            <w:tcBorders>
-              <w:top w:val="single" w:sz="4" w:space="0" w:color="auto"/>
-              <w:bottom w:val="single" w:sz="4" w:space="0" w:color="auto"/>
-            </w:tcBorders>
-          </w:tcPr>
-          <w:p>
-            <w:pPr>
-              <w:jc w:val="right"/>
-              <w:rPr>
-                <w:rFonts w:ascii="Browallia New" w:hAnsi="Browallia New" w:cs="Browallia New"/>
-                <w:sz w:val="24"/>
-                <w:szCs w:val="24"/>
-              </w:rPr>
-            </w:pPr>
-          </w:p>
-        </w:tc>
-        <w:tc>
-          <w:tcPr>
-            <w:tcW w:w="1511" w:type="dxa"/>
-            <w:tcBorders>
-              <w:top w:val="single" w:sz="4" w:space="0" w:color="auto"/>
-              <w:bottom w:val="single" w:sz="4" w:space="0" w:color="auto"/>
-            </w:tcBorders>
-          </w:tcPr>
-          <w:p>
-            <w:pPr>
-              <w:jc w:val="right"/>
-              <w:rPr>
-                <w:rFonts w:ascii="Browallia New" w:hAnsi="Browallia New" w:cs="Browallia New"/>
-                <w:sz w:val="24"/>
-                <w:szCs w:val="24"/>
-              </w:rPr>
-            </w:pPr>
-            <w:r>
-              <w:rPr>
-                <w:rFonts w:ascii="Browallia New" w:hAnsi="Browallia New" w:eastAsia="Browallia New"/>
-                <w:sz w:val="24"/>
-              </w:rPr>
-              <w:t>{</w:t>
-            </w:r>
-            <w:r>
-              <w:rPr>
-                <w:rFonts w:ascii="Browallia New" w:hAnsi="Browallia New" w:eastAsia="Browallia New"/>
-                <w:sz w:val="2"/>
-              </w:rPr>
-              <w:t>d.vatAmountFormatted}</w:t>
-            </w:r>
-          </w:p>
-        </w:tc>
-      </w:tr>
-      <w:tr>
-        <w:tc>
-          <w:tcPr>
-            <w:tcW w:w="817" w:type="dxa"/>
-            <w:tcBorders>
-              <w:top w:val="single" w:sz="4" w:space="0" w:color="auto"/>
-            </w:tcBorders>
-          </w:tcPr>
-          <w:p>
-            <w:pPr>
-              <w:jc w:val="center"/>
-              <w:rPr>
-                <w:rFonts w:ascii="Browallia New" w:hAnsi="Browallia New" w:cs="Browallia New"/>
-                <w:sz w:val="24"/>
-                <w:szCs w:val="24"/>
-              </w:rPr>
-            </w:pPr>
-          </w:p>
-        </w:tc>
-        <w:tc>
-          <w:tcPr>
-            <w:tcW w:w="717" w:type="dxa"/>
-            <w:tcBorders>
-              <w:top w:val="single" w:sz="4" w:space="0" w:color="auto"/>
-            </w:tcBorders>
-          </w:tcPr>
-          <w:p>
-            <w:pPr>
-              <w:rPr>
-                <w:rFonts w:ascii="Browallia New" w:hAnsi="Browallia New" w:cs="Browallia New"/>
-                <w:sz w:val="24"/>
-                <w:szCs w:val="24"/>
-              </w:rPr>
-            </w:pPr>
-          </w:p>
-        </w:tc>
-        <w:tc>
-          <w:tcPr>
-            <w:tcW w:w="5040" w:type="dxa"/>
-            <w:tcBorders>
-              <w:top w:val="single" w:sz="4" w:space="0" w:color="auto"/>
-            </w:tcBorders>
-          </w:tcPr>
-          <w:p>
-            <w:pPr>
-              <w:jc w:val="right"/>
-              <w:rPr>
-                <w:rFonts w:ascii="Browallia New" w:hAnsi="Browallia New" w:cs="Browallia New"/>
-                <w:sz w:val="24"/>
-                <w:szCs w:val="24"/>
-              </w:rPr>
-            </w:pPr>
-            <w:r>
-              <w:rPr>
-                <w:rFonts w:ascii="Browallia New" w:hAnsi="Browallia New" w:cs="Browallia New"/>
-                <w:sz w:val="24"/>
-                <w:szCs w:val="24"/>
-                <w:cs/>
-              </w:rPr>
-              <w:t xml:space="preserve">ราคารวม </w:t>
-            </w:r>
-            <w:r>
-              <w:rPr>
-                <w:rFonts w:ascii="Browallia New" w:hAnsi="Browallia New" w:cs="Browallia New"/>
-                <w:sz w:val="24"/>
-                <w:szCs w:val="24"/>
-              </w:rPr>
-              <w:t>vat</w:t>
-            </w:r>
-          </w:p>
-        </w:tc>
-        <w:tc>
-          <w:tcPr>
-            <w:tcW w:w="900" w:type="dxa"/>
-            <w:tcBorders>
-              <w:top w:val="single" w:sz="4" w:space="0" w:color="auto"/>
-            </w:tcBorders>
-          </w:tcPr>
-          <w:p>
-            <w:pPr>
-              <w:jc w:val="center"/>
-              <w:rPr>
-                <w:rFonts w:ascii="Browallia New" w:hAnsi="Browallia New" w:cs="Browallia New"/>
-                <w:sz w:val="24"/>
-                <w:szCs w:val="24"/>
-              </w:rPr>
-            </w:pPr>
-          </w:p>
-        </w:tc>
-        <w:tc>
-          <w:tcPr>
-            <w:tcW w:w="1080" w:type="dxa"/>
-            <w:tcBorders>
-              <w:top w:val="single" w:sz="4" w:space="0" w:color="auto"/>
-            </w:tcBorders>
-          </w:tcPr>
-          <w:p>
-            <w:pPr>
-              <w:jc w:val="right"/>
-              <w:rPr>
-                <w:rFonts w:ascii="Browallia New" w:hAnsi="Browallia New" w:cs="Browallia New"/>
-                <w:sz w:val="24"/>
-                <w:szCs w:val="24"/>
-              </w:rPr>
-            </w:pPr>
-          </w:p>
-        </w:tc>
-        <w:tc>
-          <w:tcPr>
-            <w:tcW w:w="1511" w:type="dxa"/>
-            <w:tcBorders>
-              <w:top w:val="single" w:sz="4" w:space="0" w:color="auto"/>
-            </w:tcBorders>
-          </w:tcPr>
-          <w:p>
-            <w:pPr>
-              <w:jc w:val="right"/>
-              <w:rPr>
-                <w:rFonts w:ascii="Browallia New" w:hAnsi="Browallia New" w:cs="Browallia New"/>
-                <w:sz w:val="24"/>
-                <w:szCs w:val="24"/>
-              </w:rPr>
-            </w:pPr>
-            <w:r>
-              <w:rPr>
-                <w:rFonts w:ascii="Browallia New" w:hAnsi="Browallia New" w:eastAsia="Browallia New"/>
-                <w:sz w:val="24"/>
-              </w:rPr>
-              <w:t>{</w:t>
-            </w:r>
-            <w:r>
-              <w:rPr>
-                <w:rFonts w:ascii="Browallia New" w:hAnsi="Browallia New" w:eastAsia="Browallia New"/>
+                <w:rFonts w:ascii="Browallia New" w:eastAsia="Browallia New" w:hAnsi="Browallia New"/>
                 <w:sz w:val="2"/>
               </w:rPr>
               <w:t>d.totalAmountFormatted}</w:t>
@@ -3599,17 +3545,29 @@
             </w:pPr>
             <w:r>
               <w:rPr>
+                <w:rFonts w:ascii="Browallia New" w:hAnsi="Browallia New" w:cs="Browallia New"/>
                 <w:sz w:val="24"/>
                 <w:szCs w:val="24"/>
               </w:rPr>
               <w:t>{</w:t>
             </w:r>
-            <w:r>
-              <w:rPr>
-                <w:sz w:val="2"/>
-                <w:szCs w:val="2"/>
-              </w:rPr>
-              <w:t>d.remarkLine1}</w:t>
+            <w:proofErr w:type="gramStart"/>
+            <w:r>
+              <w:rPr>
+                <w:rFonts w:ascii="Browallia New" w:hAnsi="Browallia New" w:cs="Browallia New"/>
+                <w:sz w:val="24"/>
+                <w:szCs w:val="24"/>
+              </w:rPr>
+              <w:t>d.remarkLine</w:t>
+            </w:r>
+            <w:proofErr w:type="gramEnd"/>
+            <w:r>
+              <w:rPr>
+                <w:rFonts w:ascii="Browallia New" w:hAnsi="Browallia New" w:cs="Browallia New"/>
+                <w:sz w:val="24"/>
+                <w:szCs w:val="24"/>
+              </w:rPr>
+              <w:t>1}</w:t>
             </w:r>
           </w:p>
         </w:tc>
@@ -3649,17 +3607,29 @@
             </w:pPr>
             <w:r>
               <w:rPr>
+                <w:rFonts w:ascii="Browallia New" w:hAnsi="Browallia New" w:cs="Browallia New"/>
                 <w:sz w:val="24"/>
                 <w:szCs w:val="24"/>
               </w:rPr>
               <w:t>{</w:t>
             </w:r>
-            <w:r>
-              <w:rPr>
-                <w:sz w:val="2"/>
-                <w:szCs w:val="2"/>
-              </w:rPr>
-              <w:t>d.remarkLine2}</w:t>
+            <w:proofErr w:type="gramStart"/>
+            <w:r>
+              <w:rPr>
+                <w:rFonts w:ascii="Browallia New" w:hAnsi="Browallia New" w:cs="Browallia New"/>
+                <w:sz w:val="24"/>
+                <w:szCs w:val="24"/>
+              </w:rPr>
+              <w:t>d.remarkLine</w:t>
+            </w:r>
+            <w:proofErr w:type="gramEnd"/>
+            <w:r>
+              <w:rPr>
+                <w:rFonts w:ascii="Browallia New" w:hAnsi="Browallia New" w:cs="Browallia New"/>
+                <w:sz w:val="24"/>
+                <w:szCs w:val="24"/>
+              </w:rPr>
+              <w:t>2}</w:t>
             </w:r>
           </w:p>
         </w:tc>
@@ -4088,7 +4058,6 @@
                 <w:szCs w:val="24"/>
                 <w:cs/>
               </w:rPr>
-              <w:lastRenderedPageBreak/>
               <w:t>ผู้ขอ</w:t>
             </w:r>
             <w:r>
@@ -4510,22 +4479,40 @@
       <w:jc w:val="center"/>
     </w:pPr>
     <w:r>
+      <w:rPr>
+        <w:noProof/>
+      </w:rPr>
       <w:drawing>
-        <wp:inline xmlns:a="http://schemas.openxmlformats.org/drawingml/2006/main" xmlns:pic="http://schemas.openxmlformats.org/drawingml/2006/picture">
+        <wp:anchor distT="0" distB="0" distL="114300" distR="114300" simplePos="0" relativeHeight="251658240" behindDoc="0" locked="0" layoutInCell="1" allowOverlap="1" wp14:anchorId="1BA8DB21" wp14:editId="67A432C2">
+          <wp:simplePos x="0" y="0"/>
+          <wp:positionH relativeFrom="margin">
+            <wp:posOffset>-17780</wp:posOffset>
+          </wp:positionH>
+          <wp:positionV relativeFrom="paragraph">
+            <wp:posOffset>-468630</wp:posOffset>
+          </wp:positionV>
           <wp:extent cx="5731510" cy="753474"/>
-          <wp:docPr id="1" name="{d.companyFooterImage}" descr="{d.companyFooterImage}" title="{d.companyFooterImage}"/>
+          <wp:effectExtent l="0" t="0" r="2540" b="8890"/>
+          <wp:wrapSquare wrapText="bothSides"/>
+          <wp:docPr id="654328797" name="{d.companyFooterImage}" descr="{d.companyFooterImage}" title="{d.companyFooterImage}"/>
           <wp:cNvGraphicFramePr>
-            <a:graphicFrameLocks noChangeAspect="1"/>
+            <a:graphicFrameLocks xmlns:a="http://schemas.openxmlformats.org/drawingml/2006/main" noChangeAspect="1"/>
           </wp:cNvGraphicFramePr>
-          <a:graphic>
+          <a:graphic xmlns:a="http://schemas.openxmlformats.org/drawingml/2006/main">
             <a:graphicData uri="http://schemas.openxmlformats.org/drawingml/2006/picture">
-              <pic:pic>
+              <pic:pic xmlns:pic="http://schemas.openxmlformats.org/drawingml/2006/picture">
                 <pic:nvPicPr>
                   <pic:cNvPr id="0" name="{d.companyFooterImage}" descr="{d.companyFooterImage}" title="{d.companyFooterImage}"/>
                   <pic:cNvPicPr/>
                 </pic:nvPicPr>
                 <pic:blipFill>
-                  <a:blip r:embed="rId1"/>
+                  <a:blip r:embed="rId1">
+                    <a:extLst>
+                      <a:ext uri="{28A0092B-C50C-407E-A947-70E740481C1C}">
+                        <a14:useLocalDpi xmlns:a14="http://schemas.microsoft.com/office/drawing/2010/main" val="0"/>
+                      </a:ext>
+                    </a:extLst>
+                  </a:blip>
                   <a:stretch>
                     <a:fillRect/>
                   </a:stretch>
@@ -4535,12 +4522,14 @@
                     <a:off x="0" y="0"/>
                     <a:ext cx="5731510" cy="753474"/>
                   </a:xfrm>
-                  <a:prstGeom prst="rect"/>
+                  <a:prstGeom prst="rect">
+                    <a:avLst/>
+                  </a:prstGeom>
                 </pic:spPr>
               </pic:pic>
             </a:graphicData>
           </a:graphic>
-        </wp:inline>
+        </wp:anchor>
       </w:drawing>
     </w:r>
   </w:p>
@@ -4584,16 +4573,20 @@
       <w:jc w:val="center"/>
     </w:pPr>
     <w:r>
+      <w:rPr>
+        <w:noProof/>
+      </w:rPr>
       <w:drawing>
-        <wp:inline xmlns:a="http://schemas.openxmlformats.org/drawingml/2006/main" xmlns:pic="http://schemas.openxmlformats.org/drawingml/2006/picture">
+        <wp:inline distT="0" distB="0" distL="0" distR="0" wp14:anchorId="686CD00B" wp14:editId="31761FA5">
           <wp:extent cx="5731510" cy="772735"/>
+          <wp:effectExtent l="0" t="0" r="0" b="0"/>
           <wp:docPr id="1" name="{d.companyHeaderImage}" descr="{d.companyHeaderImage}" title="{d.companyHeaderImage}"/>
           <wp:cNvGraphicFramePr>
-            <a:graphicFrameLocks noChangeAspect="1"/>
+            <a:graphicFrameLocks xmlns:a="http://schemas.openxmlformats.org/drawingml/2006/main" noChangeAspect="1"/>
           </wp:cNvGraphicFramePr>
-          <a:graphic>
+          <a:graphic xmlns:a="http://schemas.openxmlformats.org/drawingml/2006/main">
             <a:graphicData uri="http://schemas.openxmlformats.org/drawingml/2006/picture">
-              <pic:pic>
+              <pic:pic xmlns:pic="http://schemas.openxmlformats.org/drawingml/2006/picture">
                 <pic:nvPicPr>
                   <pic:cNvPr id="0" name="{d.companyHeaderImage}" descr="{d.companyHeaderImage}" title="{d.companyHeaderImage}"/>
                   <pic:cNvPicPr/>
@@ -4609,7 +4602,9 @@
                     <a:off x="0" y="0"/>
                     <a:ext cx="5731510" cy="772735"/>
                   </a:xfrm>
-                  <a:prstGeom prst="rect"/>
+                  <a:prstGeom prst="rect">
+                    <a:avLst/>
+                  </a:prstGeom>
                 </pic:spPr>
               </pic:pic>
             </a:graphicData>

</xml_diff>